<commit_message>
Add separate EC2 deployment screenshots and documentation
</commit_message>
<xml_diff>
--- a/docs/AWS_Assignment_Documentation.docx
+++ b/docs/AWS_Assignment_Documentation.docx
@@ -2856,14 +2856,1534 @@
         <w:pStyle w:val="Heading1"/>
       </w:pPr>
       <w:r>
+        <w:rPr/>
         <w:t>3. Deployment 2 — Separate EC2 Instances</w:t>
       </w:r>
     </w:p>
-    <w:p xmlns:wp14="http://schemas.microsoft.com/office/word/2010/wordml" wp14:textId="77777777">
+    <w:p>
+      <w:pPr>
+        <w:pStyle w:val="Normal"/>
+      </w:pPr>
+    </w:p>
+    <w:p>
+      <w:pPr>
+        <w:pStyle w:val="Heading3"/>
+        <w:spacing w:before="0" w:beforeAutospacing="off" w:after="281" w:afterAutospacing="off"/>
+      </w:pPr>
       <w:r>
-        <w:t>Status: Pending. Complete this section after deploying the Flask backend and Express frontend on separate EC2 instances and verifying connectivity.</w:t>
+        <w:rPr>
+          <w:rFonts w:ascii="Arial" w:hAnsi="Arial" w:eastAsia="Arial" w:cs="Arial"/>
+          <w:b w:val="1"/>
+          <w:bCs w:val="1"/>
+          <w:noProof w:val="0"/>
+          <w:sz w:val="28"/>
+          <w:szCs w:val="28"/>
+          <w:lang w:val="en-US"/>
+        </w:rPr>
+        <w:t>3.1 Objective</w:t>
       </w:r>
     </w:p>
+    <w:p>
+      <w:pPr>
+        <w:spacing w:before="240" w:beforeAutospacing="off" w:after="240" w:afterAutospacing="off"/>
+      </w:pPr>
+      <w:r>
+        <w:rPr>
+          <w:rFonts w:ascii="Arial" w:hAnsi="Arial" w:eastAsia="Arial" w:cs="Arial"/>
+          <w:noProof w:val="0"/>
+          <w:sz w:val="20"/>
+          <w:szCs w:val="20"/>
+          <w:lang w:val="en-US"/>
+        </w:rPr>
+        <w:t>Deploy the Flask backend and Express.js frontend on two separate Amazon EC2 instances and verify communication between them.</w:t>
+      </w:r>
+    </w:p>
+    <w:p>
+      <w:pPr>
+        <w:pStyle w:val="Heading3"/>
+        <w:spacing w:before="281" w:beforeAutospacing="off" w:after="281" w:afterAutospacing="off"/>
+      </w:pPr>
+      <w:r>
+        <w:rPr>
+          <w:rFonts w:ascii="Arial" w:hAnsi="Arial" w:eastAsia="Arial" w:cs="Arial"/>
+          <w:b w:val="1"/>
+          <w:bCs w:val="1"/>
+          <w:noProof w:val="0"/>
+          <w:sz w:val="28"/>
+          <w:szCs w:val="28"/>
+          <w:lang w:val="en-US"/>
+        </w:rPr>
+        <w:t>3.2 AWS Infrastructure</w:t>
+      </w:r>
+    </w:p>
+    <w:tbl>
+      <w:tblPr>
+        <w:tblStyle w:val="TableNormal"/>
+        <w:bidiVisual w:val="0"/>
+        <w:tblW w:w="0" w:type="auto"/>
+        <w:tblLook w:val="06A0" w:firstRow="1" w:lastRow="0" w:firstColumn="1" w:lastColumn="0" w:noHBand="1" w:noVBand="1"/>
+      </w:tblPr>
+      <w:tblGrid>
+        <w:gridCol w:w="1987"/>
+        <w:gridCol w:w="3245"/>
+        <w:gridCol w:w="3218"/>
+      </w:tblGrid>
+      <w:tr>
+        <w:trPr>
+          <w:trHeight w:val="300"/>
+        </w:trPr>
+        <w:tc>
+          <w:tcPr>
+            <w:tcW w:w="1987" w:type="dxa"/>
+            <w:tcMar/>
+            <w:vAlign w:val="center"/>
+          </w:tcPr>
+          <w:p>
+            <w:pPr>
+              <w:spacing w:before="0" w:beforeAutospacing="off" w:after="0" w:afterAutospacing="off"/>
+              <w:jc w:val="center"/>
+            </w:pPr>
+            <w:r>
+              <w:rPr>
+                <w:b w:val="1"/>
+                <w:bCs w:val="1"/>
+              </w:rPr>
+              <w:t>Property</w:t>
+            </w:r>
+          </w:p>
+        </w:tc>
+        <w:tc>
+          <w:tcPr>
+            <w:tcW w:w="3245" w:type="dxa"/>
+            <w:tcMar/>
+            <w:vAlign w:val="center"/>
+          </w:tcPr>
+          <w:p>
+            <w:pPr>
+              <w:spacing w:before="0" w:beforeAutospacing="off" w:after="0" w:afterAutospacing="off"/>
+              <w:jc w:val="center"/>
+            </w:pPr>
+            <w:r>
+              <w:rPr>
+                <w:b w:val="1"/>
+                <w:bCs w:val="1"/>
+              </w:rPr>
+              <w:t>Frontend EC2</w:t>
+            </w:r>
+          </w:p>
+        </w:tc>
+        <w:tc>
+          <w:tcPr>
+            <w:tcW w:w="3218" w:type="dxa"/>
+            <w:tcMar/>
+            <w:vAlign w:val="center"/>
+          </w:tcPr>
+          <w:p>
+            <w:pPr>
+              <w:spacing w:before="0" w:beforeAutospacing="off" w:after="0" w:afterAutospacing="off"/>
+              <w:jc w:val="center"/>
+            </w:pPr>
+            <w:r>
+              <w:rPr>
+                <w:b w:val="1"/>
+                <w:bCs w:val="1"/>
+              </w:rPr>
+              <w:t>Backend EC2</w:t>
+            </w:r>
+          </w:p>
+        </w:tc>
+      </w:tr>
+      <w:tr>
+        <w:trPr>
+          <w:trHeight w:val="300"/>
+        </w:trPr>
+        <w:tc>
+          <w:tcPr>
+            <w:tcW w:w="1987" w:type="dxa"/>
+            <w:tcMar/>
+            <w:vAlign w:val="center"/>
+          </w:tcPr>
+          <w:p>
+            <w:pPr>
+              <w:spacing w:before="0" w:beforeAutospacing="off" w:after="0" w:afterAutospacing="off"/>
+            </w:pPr>
+            <w:r>
+              <w:rPr/>
+              <w:t>Instance name</w:t>
+            </w:r>
+          </w:p>
+        </w:tc>
+        <w:tc>
+          <w:tcPr>
+            <w:tcW w:w="3245" w:type="dxa"/>
+            <w:tcMar/>
+            <w:vAlign w:val="center"/>
+          </w:tcPr>
+          <w:p>
+            <w:pPr>
+              <w:spacing w:before="0" w:beforeAutospacing="off" w:after="0" w:afterAutospacing="off"/>
+            </w:pPr>
+            <w:r>
+              <w:rPr/>
+              <w:t>Tutedude-AWS-Frontend-EC2</w:t>
+            </w:r>
+          </w:p>
+        </w:tc>
+        <w:tc>
+          <w:tcPr>
+            <w:tcW w:w="3218" w:type="dxa"/>
+            <w:tcMar/>
+            <w:vAlign w:val="center"/>
+          </w:tcPr>
+          <w:p>
+            <w:pPr>
+              <w:spacing w:before="0" w:beforeAutospacing="off" w:after="0" w:afterAutospacing="off"/>
+            </w:pPr>
+            <w:r>
+              <w:rPr/>
+              <w:t>Tutedude-AWS-Backend-EC2</w:t>
+            </w:r>
+          </w:p>
+        </w:tc>
+      </w:tr>
+      <w:tr>
+        <w:trPr>
+          <w:trHeight w:val="300"/>
+        </w:trPr>
+        <w:tc>
+          <w:tcPr>
+            <w:tcW w:w="1987" w:type="dxa"/>
+            <w:tcMar/>
+            <w:vAlign w:val="center"/>
+          </w:tcPr>
+          <w:p>
+            <w:pPr>
+              <w:spacing w:before="0" w:beforeAutospacing="off" w:after="0" w:afterAutospacing="off"/>
+            </w:pPr>
+            <w:r>
+              <w:rPr/>
+              <w:t>Region</w:t>
+            </w:r>
+          </w:p>
+        </w:tc>
+        <w:tc>
+          <w:tcPr>
+            <w:tcW w:w="3245" w:type="dxa"/>
+            <w:tcMar/>
+            <w:vAlign w:val="center"/>
+          </w:tcPr>
+          <w:p>
+            <w:pPr>
+              <w:spacing w:before="0" w:beforeAutospacing="off" w:after="0" w:afterAutospacing="off"/>
+            </w:pPr>
+            <w:r>
+              <w:rPr/>
+              <w:t>Mumbai (ap-south-1)</w:t>
+            </w:r>
+          </w:p>
+        </w:tc>
+        <w:tc>
+          <w:tcPr>
+            <w:tcW w:w="3218" w:type="dxa"/>
+            <w:tcMar/>
+            <w:vAlign w:val="center"/>
+          </w:tcPr>
+          <w:p>
+            <w:pPr>
+              <w:spacing w:before="0" w:beforeAutospacing="off" w:after="0" w:afterAutospacing="off"/>
+            </w:pPr>
+            <w:r>
+              <w:rPr/>
+              <w:t>Mumbai (ap-south-1)</w:t>
+            </w:r>
+          </w:p>
+        </w:tc>
+      </w:tr>
+      <w:tr>
+        <w:trPr>
+          <w:trHeight w:val="300"/>
+        </w:trPr>
+        <w:tc>
+          <w:tcPr>
+            <w:tcW w:w="1987" w:type="dxa"/>
+            <w:tcMar/>
+            <w:vAlign w:val="center"/>
+          </w:tcPr>
+          <w:p>
+            <w:pPr>
+              <w:spacing w:before="0" w:beforeAutospacing="off" w:after="0" w:afterAutospacing="off"/>
+            </w:pPr>
+            <w:r>
+              <w:rPr/>
+              <w:t>Operating system</w:t>
+            </w:r>
+          </w:p>
+        </w:tc>
+        <w:tc>
+          <w:tcPr>
+            <w:tcW w:w="3245" w:type="dxa"/>
+            <w:tcMar/>
+            <w:vAlign w:val="center"/>
+          </w:tcPr>
+          <w:p>
+            <w:pPr>
+              <w:spacing w:before="0" w:beforeAutospacing="off" w:after="0" w:afterAutospacing="off"/>
+            </w:pPr>
+            <w:r>
+              <w:rPr/>
+              <w:t>Ubuntu Server 24.04 LTS</w:t>
+            </w:r>
+          </w:p>
+        </w:tc>
+        <w:tc>
+          <w:tcPr>
+            <w:tcW w:w="3218" w:type="dxa"/>
+            <w:tcMar/>
+            <w:vAlign w:val="center"/>
+          </w:tcPr>
+          <w:p>
+            <w:pPr>
+              <w:spacing w:before="0" w:beforeAutospacing="off" w:after="0" w:afterAutospacing="off"/>
+            </w:pPr>
+            <w:r>
+              <w:rPr/>
+              <w:t>Ubuntu Server 24.04 LTS</w:t>
+            </w:r>
+          </w:p>
+        </w:tc>
+      </w:tr>
+      <w:tr>
+        <w:trPr>
+          <w:trHeight w:val="300"/>
+        </w:trPr>
+        <w:tc>
+          <w:tcPr>
+            <w:tcW w:w="1987" w:type="dxa"/>
+            <w:tcMar/>
+            <w:vAlign w:val="center"/>
+          </w:tcPr>
+          <w:p>
+            <w:pPr>
+              <w:spacing w:before="0" w:beforeAutospacing="off" w:after="0" w:afterAutospacing="off"/>
+            </w:pPr>
+            <w:r>
+              <w:rPr/>
+              <w:t>Instance type</w:t>
+            </w:r>
+          </w:p>
+        </w:tc>
+        <w:tc>
+          <w:tcPr>
+            <w:tcW w:w="3245" w:type="dxa"/>
+            <w:tcMar/>
+            <w:vAlign w:val="center"/>
+          </w:tcPr>
+          <w:p>
+            <w:pPr>
+              <w:spacing w:before="0" w:beforeAutospacing="off" w:after="0" w:afterAutospacing="off"/>
+            </w:pPr>
+            <w:r>
+              <w:rPr/>
+              <w:t>t2.micro</w:t>
+            </w:r>
+          </w:p>
+        </w:tc>
+        <w:tc>
+          <w:tcPr>
+            <w:tcW w:w="3218" w:type="dxa"/>
+            <w:tcMar/>
+            <w:vAlign w:val="center"/>
+          </w:tcPr>
+          <w:p>
+            <w:pPr>
+              <w:spacing w:before="0" w:beforeAutospacing="off" w:after="0" w:afterAutospacing="off"/>
+            </w:pPr>
+            <w:r>
+              <w:rPr/>
+              <w:t>t2.micro</w:t>
+            </w:r>
+          </w:p>
+        </w:tc>
+      </w:tr>
+      <w:tr>
+        <w:trPr>
+          <w:trHeight w:val="300"/>
+        </w:trPr>
+        <w:tc>
+          <w:tcPr>
+            <w:tcW w:w="1987" w:type="dxa"/>
+            <w:tcMar/>
+            <w:vAlign w:val="center"/>
+          </w:tcPr>
+          <w:p>
+            <w:pPr>
+              <w:spacing w:before="0" w:beforeAutospacing="off" w:after="0" w:afterAutospacing="off"/>
+            </w:pPr>
+            <w:r>
+              <w:rPr/>
+              <w:t>Private IPv4</w:t>
+            </w:r>
+          </w:p>
+        </w:tc>
+        <w:tc>
+          <w:tcPr>
+            <w:tcW w:w="3245" w:type="dxa"/>
+            <w:tcMar/>
+            <w:vAlign w:val="center"/>
+          </w:tcPr>
+          <w:p>
+            <w:pPr>
+              <w:spacing w:before="0" w:beforeAutospacing="off" w:after="0" w:afterAutospacing="off"/>
+            </w:pPr>
+            <w:r>
+              <w:rPr/>
+              <w:t>172.31.1.9</w:t>
+            </w:r>
+          </w:p>
+        </w:tc>
+        <w:tc>
+          <w:tcPr>
+            <w:tcW w:w="3218" w:type="dxa"/>
+            <w:tcMar/>
+            <w:vAlign w:val="center"/>
+          </w:tcPr>
+          <w:p>
+            <w:pPr>
+              <w:spacing w:before="0" w:beforeAutospacing="off" w:after="0" w:afterAutospacing="off"/>
+            </w:pPr>
+            <w:r>
+              <w:rPr/>
+              <w:t>172.31.1.196</w:t>
+            </w:r>
+          </w:p>
+        </w:tc>
+      </w:tr>
+      <w:tr>
+        <w:trPr>
+          <w:trHeight w:val="300"/>
+        </w:trPr>
+        <w:tc>
+          <w:tcPr>
+            <w:tcW w:w="1987" w:type="dxa"/>
+            <w:tcMar/>
+            <w:vAlign w:val="center"/>
+          </w:tcPr>
+          <w:p>
+            <w:pPr>
+              <w:spacing w:before="0" w:beforeAutospacing="off" w:after="0" w:afterAutospacing="off"/>
+            </w:pPr>
+            <w:r>
+              <w:rPr/>
+              <w:t>Application</w:t>
+            </w:r>
+          </w:p>
+        </w:tc>
+        <w:tc>
+          <w:tcPr>
+            <w:tcW w:w="3245" w:type="dxa"/>
+            <w:tcMar/>
+            <w:vAlign w:val="center"/>
+          </w:tcPr>
+          <w:p>
+            <w:pPr>
+              <w:spacing w:before="0" w:beforeAutospacing="off" w:after="0" w:afterAutospacing="off"/>
+            </w:pPr>
+            <w:r>
+              <w:rPr/>
+              <w:t>Node.js / Express</w:t>
+            </w:r>
+          </w:p>
+        </w:tc>
+        <w:tc>
+          <w:tcPr>
+            <w:tcW w:w="3218" w:type="dxa"/>
+            <w:tcMar/>
+            <w:vAlign w:val="center"/>
+          </w:tcPr>
+          <w:p>
+            <w:pPr>
+              <w:spacing w:before="0" w:beforeAutospacing="off" w:after="0" w:afterAutospacing="off"/>
+            </w:pPr>
+            <w:r>
+              <w:rPr/>
+              <w:t>Python / Flask with Gunicorn</w:t>
+            </w:r>
+          </w:p>
+        </w:tc>
+      </w:tr>
+      <w:tr>
+        <w:trPr>
+          <w:trHeight w:val="300"/>
+        </w:trPr>
+        <w:tc>
+          <w:tcPr>
+            <w:tcW w:w="1987" w:type="dxa"/>
+            <w:tcMar/>
+            <w:vAlign w:val="center"/>
+          </w:tcPr>
+          <w:p>
+            <w:pPr>
+              <w:spacing w:before="0" w:beforeAutospacing="off" w:after="0" w:afterAutospacing="off"/>
+            </w:pPr>
+            <w:r>
+              <w:rPr/>
+              <w:t>Port</w:t>
+            </w:r>
+          </w:p>
+        </w:tc>
+        <w:tc>
+          <w:tcPr>
+            <w:tcW w:w="3245" w:type="dxa"/>
+            <w:tcMar/>
+            <w:vAlign w:val="center"/>
+          </w:tcPr>
+          <w:p>
+            <w:pPr>
+              <w:spacing w:before="0" w:beforeAutospacing="off" w:after="0" w:afterAutospacing="off"/>
+            </w:pPr>
+            <w:r>
+              <w:rPr/>
+              <w:t>TCP 3000</w:t>
+            </w:r>
+          </w:p>
+        </w:tc>
+        <w:tc>
+          <w:tcPr>
+            <w:tcW w:w="3218" w:type="dxa"/>
+            <w:tcMar/>
+            <w:vAlign w:val="center"/>
+          </w:tcPr>
+          <w:p>
+            <w:pPr>
+              <w:spacing w:before="0" w:beforeAutospacing="off" w:after="0" w:afterAutospacing="off"/>
+            </w:pPr>
+            <w:r>
+              <w:rPr/>
+              <w:t>TCP 5000</w:t>
+            </w:r>
+          </w:p>
+        </w:tc>
+      </w:tr>
+    </w:tbl>
+    <w:p>
+      <w:pPr>
+        <w:bidi w:val="0"/>
+        <w:spacing w:before="240" w:beforeAutospacing="off" w:after="240" w:afterAutospacing="off"/>
+      </w:pPr>
+      <w:r>
+        <w:rPr>
+          <w:rFonts w:ascii="Arial" w:hAnsi="Arial" w:eastAsia="Arial" w:cs="Arial"/>
+          <w:noProof w:val="0"/>
+          <w:sz w:val="20"/>
+          <w:szCs w:val="20"/>
+          <w:lang w:val="en-US"/>
+        </w:rPr>
+        <w:t xml:space="preserve">Frontend URL: </w:t>
+      </w:r>
+      <w:hyperlink r:id="R7ef4359959324fc7">
+        <w:r>
+          <w:rPr>
+            <w:rStyle w:val="Hyperlink"/>
+            <w:noProof w:val="0"/>
+            <w:lang w:val="en-US"/>
+          </w:rPr>
+          <w:t>http://43.204.143.51:3000</w:t>
+        </w:r>
+      </w:hyperlink>
+    </w:p>
+    <w:p>
+      <w:pPr>
+        <w:pStyle w:val="Heading3"/>
+        <w:bidi w:val="0"/>
+        <w:spacing w:before="281" w:beforeAutospacing="off" w:after="281" w:afterAutospacing="off"/>
+      </w:pPr>
+      <w:r>
+        <w:rPr>
+          <w:rFonts w:ascii="Arial" w:hAnsi="Arial" w:eastAsia="Arial" w:cs="Arial"/>
+          <w:b w:val="1"/>
+          <w:bCs w:val="1"/>
+          <w:noProof w:val="0"/>
+          <w:sz w:val="28"/>
+          <w:szCs w:val="28"/>
+          <w:lang w:val="en-US"/>
+        </w:rPr>
+        <w:t>3.3 Application Architecture</w:t>
+      </w:r>
+    </w:p>
+    <w:p>
+      <w:pPr>
+        <w:bidi w:val="0"/>
+        <w:spacing w:before="240" w:beforeAutospacing="off" w:after="240" w:afterAutospacing="off"/>
+      </w:pPr>
+      <w:r>
+        <w:rPr>
+          <w:rFonts w:ascii="Arial" w:hAnsi="Arial" w:eastAsia="Arial" w:cs="Arial"/>
+          <w:noProof w:val="0"/>
+          <w:sz w:val="20"/>
+          <w:szCs w:val="20"/>
+          <w:lang w:val="en-US"/>
+        </w:rPr>
+        <w:t xml:space="preserve">The frontend EC2 instance receives browser requests on TCP port 3000. It communicates with the Flask backend using the private address </w:t>
+      </w:r>
+      <w:hyperlink r:id="R555350469cf1417d">
+        <w:r>
+          <w:rPr>
+            <w:rStyle w:val="Hyperlink"/>
+            <w:noProof w:val="0"/>
+            <w:lang w:val="en-US"/>
+          </w:rPr>
+          <w:t>http://172.31.1.196:5000</w:t>
+        </w:r>
+      </w:hyperlink>
+      <w:r>
+        <w:rPr>
+          <w:rFonts w:ascii="Arial" w:hAnsi="Arial" w:eastAsia="Arial" w:cs="Arial"/>
+          <w:noProof w:val="0"/>
+          <w:sz w:val="20"/>
+          <w:szCs w:val="20"/>
+          <w:lang w:val="en-US"/>
+        </w:rPr>
+        <w:t>. The backend is hosted on a separate EC2 instance.</w:t>
+      </w:r>
+    </w:p>
+    <w:p>
+      <w:pPr>
+        <w:pStyle w:val="Heading3"/>
+        <w:bidi w:val="0"/>
+        <w:spacing w:before="281" w:beforeAutospacing="off" w:after="281" w:afterAutospacing="off"/>
+      </w:pPr>
+      <w:r>
+        <w:rPr>
+          <w:rFonts w:ascii="Arial" w:hAnsi="Arial" w:eastAsia="Arial" w:cs="Arial"/>
+          <w:b w:val="1"/>
+          <w:bCs w:val="1"/>
+          <w:noProof w:val="0"/>
+          <w:sz w:val="28"/>
+          <w:szCs w:val="28"/>
+          <w:lang w:val="en-US"/>
+        </w:rPr>
+        <w:t>3.4 Service Configuration</w:t>
+      </w:r>
+    </w:p>
+    <w:p>
+      <w:pPr>
+        <w:bidi w:val="0"/>
+        <w:spacing w:before="240" w:beforeAutospacing="off" w:after="240" w:afterAutospacing="off"/>
+      </w:pPr>
+      <w:r>
+        <w:rPr>
+          <w:rFonts w:ascii="Arial" w:hAnsi="Arial" w:eastAsia="Arial" w:cs="Arial"/>
+          <w:noProof w:val="0"/>
+          <w:sz w:val="20"/>
+          <w:szCs w:val="20"/>
+          <w:lang w:val="en-US"/>
+        </w:rPr>
+        <w:t>Both applications are configured as systemd services:</w:t>
+      </w:r>
+    </w:p>
+    <w:p>
+      <w:pPr>
+        <w:pStyle w:val="ListParagraph"/>
+        <w:numPr>
+          <w:ilvl w:val="0"/>
+          <w:numId w:val="12"/>
+        </w:numPr>
+        <w:bidi w:val="0"/>
+        <w:spacing w:before="240" w:beforeAutospacing="off" w:after="240" w:afterAutospacing="off"/>
+        <w:rPr>
+          <w:rFonts w:ascii="Consolas" w:hAnsi="Consolas" w:eastAsia="Consolas" w:cs="Consolas"/>
+          <w:noProof w:val="0"/>
+          <w:sz w:val="20"/>
+          <w:szCs w:val="20"/>
+          <w:lang w:val="en-US"/>
+        </w:rPr>
+      </w:pPr>
+      <w:r>
+        <w:rPr>
+          <w:rFonts w:ascii="Consolas" w:hAnsi="Consolas" w:eastAsia="Consolas" w:cs="Consolas"/>
+          <w:noProof w:val="0"/>
+          <w:sz w:val="20"/>
+          <w:szCs w:val="20"/>
+          <w:lang w:val="en-US"/>
+        </w:rPr>
+        <w:t>tutedude-frontend.service</w:t>
+      </w:r>
+    </w:p>
+    <w:p>
+      <w:pPr>
+        <w:pStyle w:val="ListParagraph"/>
+        <w:numPr>
+          <w:ilvl w:val="0"/>
+          <w:numId w:val="12"/>
+        </w:numPr>
+        <w:bidi w:val="0"/>
+        <w:spacing w:before="240" w:beforeAutospacing="off" w:after="240" w:afterAutospacing="off"/>
+        <w:rPr>
+          <w:rFonts w:ascii="Consolas" w:hAnsi="Consolas" w:eastAsia="Consolas" w:cs="Consolas"/>
+          <w:noProof w:val="0"/>
+          <w:sz w:val="20"/>
+          <w:szCs w:val="20"/>
+          <w:lang w:val="en-US"/>
+        </w:rPr>
+      </w:pPr>
+      <w:r>
+        <w:rPr>
+          <w:rFonts w:ascii="Consolas" w:hAnsi="Consolas" w:eastAsia="Consolas" w:cs="Consolas"/>
+          <w:noProof w:val="0"/>
+          <w:sz w:val="20"/>
+          <w:szCs w:val="20"/>
+          <w:lang w:val="en-US"/>
+        </w:rPr>
+        <w:t>tutedude-backend.service</w:t>
+      </w:r>
+    </w:p>
+    <w:p>
+      <w:pPr>
+        <w:bidi w:val="0"/>
+        <w:spacing w:before="240" w:beforeAutospacing="off" w:after="240" w:afterAutospacing="off"/>
+      </w:pPr>
+      <w:r>
+        <w:rPr>
+          <w:rFonts w:ascii="Arial" w:hAnsi="Arial" w:eastAsia="Arial" w:cs="Arial"/>
+          <w:noProof w:val="0"/>
+          <w:sz w:val="20"/>
+          <w:szCs w:val="20"/>
+          <w:lang w:val="en-US"/>
+        </w:rPr>
+        <w:t xml:space="preserve">Both services were verified as </w:t>
+      </w:r>
+      <w:r>
+        <w:rPr>
+          <w:rFonts w:ascii="Consolas" w:hAnsi="Consolas" w:eastAsia="Consolas" w:cs="Consolas"/>
+          <w:noProof w:val="0"/>
+          <w:sz w:val="20"/>
+          <w:szCs w:val="20"/>
+          <w:lang w:val="en-US"/>
+        </w:rPr>
+        <w:t>active (running)</w:t>
+      </w:r>
+      <w:r>
+        <w:rPr>
+          <w:rFonts w:ascii="Arial" w:hAnsi="Arial" w:eastAsia="Arial" w:cs="Arial"/>
+          <w:noProof w:val="0"/>
+          <w:sz w:val="20"/>
+          <w:szCs w:val="20"/>
+          <w:lang w:val="en-US"/>
+        </w:rPr>
+        <w:t xml:space="preserve"> and are enabled to start automatically at boot.</w:t>
+      </w:r>
+    </w:p>
+    <w:p>
+      <w:pPr>
+        <w:pStyle w:val="Heading3"/>
+        <w:bidi w:val="0"/>
+        <w:spacing w:before="281" w:beforeAutospacing="off" w:after="281" w:afterAutospacing="off"/>
+      </w:pPr>
+      <w:r>
+        <w:rPr>
+          <w:rFonts w:ascii="Arial" w:hAnsi="Arial" w:eastAsia="Arial" w:cs="Arial"/>
+          <w:b w:val="1"/>
+          <w:bCs w:val="1"/>
+          <w:noProof w:val="0"/>
+          <w:sz w:val="28"/>
+          <w:szCs w:val="28"/>
+          <w:lang w:val="en-US"/>
+        </w:rPr>
+        <w:t>3.5 Verification Commands</w:t>
+      </w:r>
+    </w:p>
+    <w:p>
+      <w:pPr>
+        <w:bidi w:val="0"/>
+        <w:spacing w:before="240" w:beforeAutospacing="off" w:after="240" w:afterAutospacing="off"/>
+      </w:pPr>
+      <w:r>
+        <w:rPr>
+          <w:rFonts w:ascii="Arial" w:hAnsi="Arial" w:eastAsia="Arial" w:cs="Arial"/>
+          <w:noProof w:val="0"/>
+          <w:sz w:val="20"/>
+          <w:szCs w:val="20"/>
+          <w:lang w:val="en-US"/>
+        </w:rPr>
+        <w:t>Frontend EC2:</w:t>
+      </w:r>
+    </w:p>
+    <w:p>
+      <w:r>
+        <w:rPr>
+          <w:rFonts w:ascii="Consolas" w:hAnsi="Consolas" w:eastAsia="Consolas" w:cs="Consolas"/>
+          <w:noProof w:val="0"/>
+          <w:sz w:val="20"/>
+          <w:szCs w:val="20"/>
+          <w:lang w:val="en-US"/>
+        </w:rPr>
+        <w:t>sudo systemctl status tutedude-frontend --no-pager</w:t>
+      </w:r>
+      <w:r>
+        <w:br/>
+      </w:r>
+      <w:r>
+        <w:rPr>
+          <w:rFonts w:ascii="Consolas" w:hAnsi="Consolas" w:eastAsia="Consolas" w:cs="Consolas"/>
+          <w:noProof w:val="0"/>
+          <w:sz w:val="20"/>
+          <w:szCs w:val="20"/>
+          <w:lang w:val="en-US"/>
+        </w:rPr>
+        <w:t xml:space="preserve">curl </w:t>
+      </w:r>
+      <w:hyperlink r:id="R62adfb9b76c64769">
+        <w:r>
+          <w:rPr>
+            <w:rStyle w:val="Hyperlink"/>
+            <w:noProof w:val="0"/>
+            <w:lang w:val="en-US"/>
+          </w:rPr>
+          <w:t>http://127.0.0.1:3000/health</w:t>
+        </w:r>
+      </w:hyperlink>
+      <w:r>
+        <w:br/>
+      </w:r>
+      <w:r>
+        <w:rPr>
+          <w:rFonts w:ascii="Consolas" w:hAnsi="Consolas" w:eastAsia="Consolas" w:cs="Consolas"/>
+          <w:noProof w:val="0"/>
+          <w:sz w:val="20"/>
+          <w:szCs w:val="20"/>
+          <w:lang w:val="en-US"/>
+        </w:rPr>
+        <w:t xml:space="preserve">curl -s </w:t>
+      </w:r>
+      <w:hyperlink r:id="Rd98724f495e94202">
+        <w:r>
+          <w:rPr>
+            <w:rStyle w:val="Hyperlink"/>
+            <w:noProof w:val="0"/>
+            <w:lang w:val="en-US"/>
+          </w:rPr>
+          <w:t>http://127.0.0.1:3000/</w:t>
+        </w:r>
+      </w:hyperlink>
+    </w:p>
+    <w:p>
+      <w:pPr>
+        <w:bidi w:val="0"/>
+        <w:spacing w:before="240" w:beforeAutospacing="off" w:after="240" w:afterAutospacing="off"/>
+      </w:pPr>
+      <w:r>
+        <w:rPr>
+          <w:rFonts w:ascii="Arial" w:hAnsi="Arial" w:eastAsia="Arial" w:cs="Arial"/>
+          <w:noProof w:val="0"/>
+          <w:sz w:val="20"/>
+          <w:szCs w:val="20"/>
+          <w:lang w:val="en-US"/>
+        </w:rPr>
+        <w:t>Backend EC2:</w:t>
+      </w:r>
+    </w:p>
+    <w:p>
+      <w:r>
+        <w:rPr>
+          <w:rFonts w:ascii="Consolas" w:hAnsi="Consolas" w:eastAsia="Consolas" w:cs="Consolas"/>
+          <w:noProof w:val="0"/>
+          <w:sz w:val="20"/>
+          <w:szCs w:val="20"/>
+          <w:lang w:val="en-US"/>
+        </w:rPr>
+        <w:t>sudo systemctl status tutedude-backend --no-pager</w:t>
+      </w:r>
+      <w:r>
+        <w:br/>
+      </w:r>
+      <w:r>
+        <w:rPr>
+          <w:rFonts w:ascii="Consolas" w:hAnsi="Consolas" w:eastAsia="Consolas" w:cs="Consolas"/>
+          <w:noProof w:val="0"/>
+          <w:sz w:val="20"/>
+          <w:szCs w:val="20"/>
+          <w:lang w:val="en-US"/>
+        </w:rPr>
+        <w:t xml:space="preserve">curl </w:t>
+      </w:r>
+      <w:hyperlink r:id="Rfaa0b2f5dedc4c55">
+        <w:r>
+          <w:rPr>
+            <w:rStyle w:val="Hyperlink"/>
+            <w:noProof w:val="0"/>
+            <w:lang w:val="en-US"/>
+          </w:rPr>
+          <w:t>http://127.0.0.1:5000/health</w:t>
+        </w:r>
+      </w:hyperlink>
+    </w:p>
+    <w:p>
+      <w:pPr>
+        <w:bidi w:val="0"/>
+        <w:spacing w:before="240" w:beforeAutospacing="off" w:after="240" w:afterAutospacing="off"/>
+      </w:pPr>
+      <w:r>
+        <w:rPr>
+          <w:rFonts w:ascii="Arial" w:hAnsi="Arial" w:eastAsia="Arial" w:cs="Arial"/>
+          <w:noProof w:val="0"/>
+          <w:sz w:val="20"/>
+          <w:szCs w:val="20"/>
+          <w:lang w:val="en-US"/>
+        </w:rPr>
+        <w:t>The browser test succeeded. The page displayed the Tutedude AWS Assignment title and showed both the Express frontend and Flask backend as running.</w:t>
+      </w:r>
+    </w:p>
+    <w:p>
+      <w:pPr>
+        <w:pStyle w:val="Heading3"/>
+        <w:bidi w:val="0"/>
+        <w:spacing w:before="281" w:beforeAutospacing="off" w:after="281" w:afterAutospacing="off"/>
+      </w:pPr>
+      <w:r>
+        <w:rPr>
+          <w:rFonts w:ascii="Arial" w:hAnsi="Arial" w:eastAsia="Arial" w:cs="Arial"/>
+          <w:b w:val="1"/>
+          <w:bCs w:val="1"/>
+          <w:noProof w:val="0"/>
+          <w:sz w:val="28"/>
+          <w:szCs w:val="28"/>
+          <w:lang w:val="en-US"/>
+        </w:rPr>
+        <w:t>3.6 Security</w:t>
+      </w:r>
+    </w:p>
+    <w:p>
+      <w:pPr>
+        <w:pStyle w:val="ListParagraph"/>
+        <w:numPr>
+          <w:ilvl w:val="0"/>
+          <w:numId w:val="13"/>
+        </w:numPr>
+        <w:bidi w:val="0"/>
+        <w:spacing w:before="240" w:beforeAutospacing="off" w:after="240" w:afterAutospacing="off"/>
+        <w:rPr>
+          <w:rFonts w:ascii="Arial" w:hAnsi="Arial" w:eastAsia="Arial" w:cs="Arial"/>
+          <w:noProof w:val="0"/>
+          <w:sz w:val="20"/>
+          <w:szCs w:val="20"/>
+          <w:lang w:val="en-US"/>
+        </w:rPr>
+      </w:pPr>
+      <w:r>
+        <w:rPr>
+          <w:rFonts w:ascii="Arial" w:hAnsi="Arial" w:eastAsia="Arial" w:cs="Arial"/>
+          <w:noProof w:val="0"/>
+          <w:sz w:val="20"/>
+          <w:szCs w:val="20"/>
+          <w:lang w:val="en-US"/>
+        </w:rPr>
+        <w:t>SSH access is restricted to the authorized client IP address.</w:t>
+      </w:r>
+    </w:p>
+    <w:p>
+      <w:pPr>
+        <w:pStyle w:val="ListParagraph"/>
+        <w:numPr>
+          <w:ilvl w:val="0"/>
+          <w:numId w:val="13"/>
+        </w:numPr>
+        <w:bidi w:val="0"/>
+        <w:spacing w:before="240" w:beforeAutospacing="off" w:after="240" w:afterAutospacing="off"/>
+        <w:rPr>
+          <w:rFonts w:ascii="Arial" w:hAnsi="Arial" w:eastAsia="Arial" w:cs="Arial"/>
+          <w:noProof w:val="0"/>
+          <w:sz w:val="20"/>
+          <w:szCs w:val="20"/>
+          <w:lang w:val="en-US"/>
+        </w:rPr>
+      </w:pPr>
+      <w:r>
+        <w:rPr>
+          <w:rFonts w:ascii="Arial" w:hAnsi="Arial" w:eastAsia="Arial" w:cs="Arial"/>
+          <w:noProof w:val="0"/>
+          <w:sz w:val="20"/>
+          <w:szCs w:val="20"/>
+          <w:lang w:val="en-US"/>
+        </w:rPr>
+        <w:t>Frontend TCP port 3000 is restricted to the authorized client IP address.</w:t>
+      </w:r>
+    </w:p>
+    <w:p>
+      <w:pPr>
+        <w:pStyle w:val="ListParagraph"/>
+        <w:numPr>
+          <w:ilvl w:val="0"/>
+          <w:numId w:val="13"/>
+        </w:numPr>
+        <w:bidi w:val="0"/>
+        <w:spacing w:before="240" w:beforeAutospacing="off" w:after="240" w:afterAutospacing="off"/>
+        <w:rPr>
+          <w:rFonts w:ascii="Arial" w:hAnsi="Arial" w:eastAsia="Arial" w:cs="Arial"/>
+          <w:noProof w:val="0"/>
+          <w:sz w:val="20"/>
+          <w:szCs w:val="20"/>
+          <w:lang w:val="en-US"/>
+        </w:rPr>
+      </w:pPr>
+      <w:r>
+        <w:rPr>
+          <w:rFonts w:ascii="Arial" w:hAnsi="Arial" w:eastAsia="Arial" w:cs="Arial"/>
+          <w:noProof w:val="0"/>
+          <w:sz w:val="20"/>
+          <w:szCs w:val="20"/>
+          <w:lang w:val="en-US"/>
+        </w:rPr>
+        <w:t>Backend TCP port 5000 is allowed from the frontend security group rather than opened to the public internet.</w:t>
+      </w:r>
+    </w:p>
+    <w:p>
+      <w:pPr>
+        <w:pStyle w:val="ListParagraph"/>
+        <w:numPr>
+          <w:ilvl w:val="0"/>
+          <w:numId w:val="13"/>
+        </w:numPr>
+        <w:bidi w:val="0"/>
+        <w:spacing w:before="240" w:beforeAutospacing="off" w:after="240" w:afterAutospacing="off"/>
+        <w:rPr>
+          <w:rFonts w:ascii="Arial" w:hAnsi="Arial" w:eastAsia="Arial" w:cs="Arial"/>
+          <w:noProof w:val="0"/>
+          <w:sz w:val="20"/>
+          <w:szCs w:val="20"/>
+          <w:lang w:val="en-US"/>
+        </w:rPr>
+      </w:pPr>
+      <w:r>
+        <w:rPr>
+          <w:rFonts w:ascii="Arial" w:hAnsi="Arial" w:eastAsia="Arial" w:cs="Arial"/>
+          <w:noProof w:val="0"/>
+          <w:sz w:val="20"/>
+          <w:szCs w:val="20"/>
+          <w:lang w:val="en-US"/>
+        </w:rPr>
+        <w:t>The SSH private key is kept outside the GitHub repository.</w:t>
+      </w:r>
+    </w:p>
+    <w:p>
+      <w:pPr>
+        <w:pStyle w:val="Heading3"/>
+        <w:bidi w:val="0"/>
+        <w:spacing w:before="281" w:beforeAutospacing="off" w:after="281" w:afterAutospacing="off"/>
+      </w:pPr>
+      <w:r>
+        <w:rPr>
+          <w:rFonts w:ascii="Arial" w:hAnsi="Arial" w:eastAsia="Arial" w:cs="Arial"/>
+          <w:b w:val="1"/>
+          <w:bCs w:val="1"/>
+          <w:noProof w:val="0"/>
+          <w:sz w:val="28"/>
+          <w:szCs w:val="28"/>
+          <w:lang w:val="en-US"/>
+        </w:rPr>
+        <w:t>3.7 Screenshot Evidence</w:t>
+      </w:r>
+    </w:p>
+    <w:p>
+      <w:pPr>
+        <w:bidi w:val="0"/>
+        <w:spacing w:before="240" w:beforeAutospacing="off" w:after="240" w:afterAutospacing="off"/>
+      </w:pPr>
+      <w:r>
+        <w:rPr>
+          <w:rFonts w:ascii="Arial" w:hAnsi="Arial" w:eastAsia="Arial" w:cs="Arial"/>
+          <w:noProof w:val="0"/>
+          <w:sz w:val="20"/>
+          <w:szCs w:val="20"/>
+          <w:lang w:val="en-US"/>
+        </w:rPr>
+        <w:t xml:space="preserve">The following screenshots are saved in the project's </w:t>
+      </w:r>
+      <w:r>
+        <w:rPr>
+          <w:rFonts w:ascii="Consolas" w:hAnsi="Consolas" w:eastAsia="Consolas" w:cs="Consolas"/>
+          <w:noProof w:val="0"/>
+          <w:sz w:val="20"/>
+          <w:szCs w:val="20"/>
+          <w:lang w:val="en-US"/>
+        </w:rPr>
+        <w:t>screenshots</w:t>
+      </w:r>
+      <w:r>
+        <w:rPr>
+          <w:rFonts w:ascii="Arial" w:hAnsi="Arial" w:eastAsia="Arial" w:cs="Arial"/>
+          <w:noProof w:val="0"/>
+          <w:sz w:val="20"/>
+          <w:szCs w:val="20"/>
+          <w:lang w:val="en-US"/>
+        </w:rPr>
+        <w:t xml:space="preserve"> folder:</w:t>
+      </w:r>
+    </w:p>
+    <w:p>
+      <w:pPr>
+        <w:pStyle w:val="ListParagraph"/>
+        <w:bidi w:val="0"/>
+        <w:spacing w:before="240" w:beforeAutospacing="off" w:after="240" w:afterAutospacing="off"/>
+        <w:ind w:left="720"/>
+        <w:rPr>
+          <w:rFonts w:ascii="Consolas" w:hAnsi="Consolas" w:eastAsia="Consolas" w:cs="Consolas"/>
+          <w:noProof w:val="0"/>
+          <w:sz w:val="20"/>
+          <w:szCs w:val="20"/>
+          <w:lang w:val="en-US"/>
+        </w:rPr>
+      </w:pPr>
+    </w:p>
+    <w:p>
+      <w:pPr>
+        <w:pStyle w:val="ListParagraph"/>
+        <w:bidi w:val="0"/>
+        <w:spacing w:before="240" w:beforeAutospacing="off" w:after="240" w:afterAutospacing="off"/>
+        <w:ind w:left="720"/>
+        <w:rPr>
+          <w:rFonts w:ascii="Consolas" w:hAnsi="Consolas" w:eastAsia="Consolas" w:cs="Consolas"/>
+          <w:noProof w:val="0"/>
+          <w:sz w:val="20"/>
+          <w:szCs w:val="20"/>
+          <w:lang w:val="en-US"/>
+        </w:rPr>
+      </w:pPr>
+    </w:p>
+    <w:p>
+      <w:pPr>
+        <w:pStyle w:val="ListParagraph"/>
+        <w:bidi w:val="0"/>
+        <w:spacing w:before="240" w:beforeAutospacing="off" w:after="240" w:afterAutospacing="off"/>
+        <w:ind w:left="720"/>
+        <w:rPr>
+          <w:rFonts w:ascii="Consolas" w:hAnsi="Consolas" w:eastAsia="Consolas" w:cs="Consolas"/>
+          <w:noProof w:val="0"/>
+          <w:sz w:val="20"/>
+          <w:szCs w:val="20"/>
+          <w:lang w:val="en-US"/>
+        </w:rPr>
+      </w:pPr>
+    </w:p>
+    <w:p>
+      <w:pPr>
+        <w:pStyle w:val="ListParagraph"/>
+        <w:bidi w:val="0"/>
+        <w:spacing w:before="240" w:beforeAutospacing="off" w:after="240" w:afterAutospacing="off"/>
+        <w:ind w:left="720"/>
+        <w:rPr>
+          <w:rFonts w:ascii="Consolas" w:hAnsi="Consolas" w:eastAsia="Consolas" w:cs="Consolas"/>
+          <w:noProof w:val="0"/>
+          <w:sz w:val="20"/>
+          <w:szCs w:val="20"/>
+          <w:lang w:val="en-US"/>
+        </w:rPr>
+      </w:pPr>
+    </w:p>
+    <w:p>
+      <w:pPr>
+        <w:pStyle w:val="ListParagraph"/>
+        <w:bidi w:val="0"/>
+        <w:spacing w:before="240" w:beforeAutospacing="off" w:after="240" w:afterAutospacing="off"/>
+        <w:ind w:left="720"/>
+        <w:rPr>
+          <w:rFonts w:ascii="Consolas" w:hAnsi="Consolas" w:eastAsia="Consolas" w:cs="Consolas"/>
+          <w:noProof w:val="0"/>
+          <w:sz w:val="20"/>
+          <w:szCs w:val="20"/>
+          <w:lang w:val="en-US"/>
+        </w:rPr>
+      </w:pPr>
+    </w:p>
+    <w:p>
+      <w:pPr>
+        <w:pStyle w:val="ListParagraph"/>
+        <w:bidi w:val="0"/>
+        <w:spacing w:before="240" w:beforeAutospacing="off" w:after="240" w:afterAutospacing="off"/>
+        <w:ind w:left="720"/>
+        <w:rPr>
+          <w:rFonts w:ascii="Consolas" w:hAnsi="Consolas" w:eastAsia="Consolas" w:cs="Consolas"/>
+          <w:noProof w:val="0"/>
+          <w:sz w:val="20"/>
+          <w:szCs w:val="20"/>
+          <w:lang w:val="en-US"/>
+        </w:rPr>
+      </w:pPr>
+    </w:p>
+    <w:p>
+      <w:pPr>
+        <w:pStyle w:val="ListParagraph"/>
+        <w:bidi w:val="0"/>
+        <w:spacing w:before="240" w:beforeAutospacing="off" w:after="240" w:afterAutospacing="off"/>
+        <w:ind w:left="720"/>
+        <w:rPr>
+          <w:rFonts w:ascii="Consolas" w:hAnsi="Consolas" w:eastAsia="Consolas" w:cs="Consolas"/>
+          <w:noProof w:val="0"/>
+          <w:sz w:val="20"/>
+          <w:szCs w:val="20"/>
+          <w:lang w:val="en-US"/>
+        </w:rPr>
+      </w:pPr>
+      <w:r>
+        <w:drawing>
+          <wp:inline wp14:editId="769989CB" wp14:anchorId="4C816C2D">
+            <wp:extent cx="6324600" cy="3476625"/>
+            <wp:effectExtent l="0" t="0" r="0" b="0"/>
+            <wp:docPr id="260144724" name="drawing"/>
+            <wp:cNvGraphicFramePr>
+              <a:graphicFrameLocks noChangeAspect="1"/>
+            </wp:cNvGraphicFramePr>
+            <a:graphic>
+              <a:graphicData xmlns:a="http://schemas.openxmlformats.org/drawingml/2006/main" uri="http://schemas.openxmlformats.org/drawingml/2006/picture">
+                <pic:pic xmlns:pic="http://schemas.openxmlformats.org/drawingml/2006/picture">
+                  <pic:nvPicPr>
+                    <pic:cNvPr id="260144724" name="Picture 260144724"/>
+                    <pic:cNvPicPr/>
+                  </pic:nvPicPr>
+                  <pic:blipFill>
+                    <a:blip xmlns:r="http://schemas.openxmlformats.org/officeDocument/2006/relationships" r:embed="rId793340488">
+                      <a:extLst>
+                        <a:ext uri="{28A0092B-C50C-407E-A947-70E740481C1C}">
+                          <a14:useLocalDpi xmlns:a14="http://schemas.microsoft.com/office/drawing/2010/main"/>
+                        </a:ext>
+                      </a:extLst>
+                    </a:blip>
+                    <a:stretch>
+                      <a:fillRect/>
+                    </a:stretch>
+                  </pic:blipFill>
+                  <pic:spPr>
+                    <a:xfrm>
+                      <a:off x="0" y="0"/>
+                      <a:ext cx="6324600" cy="3476625"/>
+                    </a:xfrm>
+                    <a:prstGeom prst="rect">
+                      <a:avLst/>
+                    </a:prstGeom>
+                  </pic:spPr>
+                </pic:pic>
+              </a:graphicData>
+            </a:graphic>
+          </wp:inline>
+        </w:drawing>
+      </w:r>
+    </w:p>
+    <w:p>
+      <w:pPr>
+        <w:pStyle w:val="ListParagraph"/>
+        <w:bidi w:val="0"/>
+        <w:spacing w:before="240" w:beforeAutospacing="off" w:after="240" w:afterAutospacing="off"/>
+        <w:ind w:left="720"/>
+        <w:rPr>
+          <w:rFonts w:ascii="Consolas" w:hAnsi="Consolas" w:eastAsia="Consolas" w:cs="Consolas"/>
+          <w:noProof w:val="0"/>
+          <w:sz w:val="20"/>
+          <w:szCs w:val="20"/>
+          <w:lang w:val="en-US"/>
+        </w:rPr>
+      </w:pPr>
+    </w:p>
+    <w:p>
+      <w:pPr>
+        <w:pStyle w:val="ListParagraph"/>
+        <w:bidi w:val="0"/>
+        <w:spacing w:before="240" w:beforeAutospacing="off" w:after="240" w:afterAutospacing="off"/>
+        <w:ind w:left="720"/>
+        <w:rPr>
+          <w:rFonts w:ascii="Consolas" w:hAnsi="Consolas" w:eastAsia="Consolas" w:cs="Consolas"/>
+          <w:noProof w:val="0"/>
+          <w:sz w:val="20"/>
+          <w:szCs w:val="20"/>
+          <w:lang w:val="en-US"/>
+        </w:rPr>
+      </w:pPr>
+    </w:p>
+    <w:p>
+      <w:pPr>
+        <w:pStyle w:val="ListParagraph"/>
+        <w:bidi w:val="0"/>
+        <w:spacing w:before="240" w:beforeAutospacing="off" w:after="240" w:afterAutospacing="off"/>
+        <w:ind w:left="720"/>
+        <w:rPr>
+          <w:rFonts w:ascii="Consolas" w:hAnsi="Consolas" w:eastAsia="Consolas" w:cs="Consolas"/>
+          <w:noProof w:val="0"/>
+          <w:sz w:val="20"/>
+          <w:szCs w:val="20"/>
+          <w:lang w:val="en-US"/>
+        </w:rPr>
+      </w:pPr>
+      <w:r>
+        <w:drawing>
+          <wp:inline wp14:editId="3F40B70B" wp14:anchorId="69F15FA2">
+            <wp:extent cx="6324600" cy="2085975"/>
+            <wp:effectExtent l="0" t="0" r="0" b="0"/>
+            <wp:docPr id="149086025" name="drawing"/>
+            <wp:cNvGraphicFramePr>
+              <a:graphicFrameLocks noChangeAspect="1"/>
+            </wp:cNvGraphicFramePr>
+            <a:graphic>
+              <a:graphicData xmlns:a="http://schemas.openxmlformats.org/drawingml/2006/main" uri="http://schemas.openxmlformats.org/drawingml/2006/picture">
+                <pic:pic xmlns:pic="http://schemas.openxmlformats.org/drawingml/2006/picture">
+                  <pic:nvPicPr>
+                    <pic:cNvPr id="149086025" name="Picture 149086025"/>
+                    <pic:cNvPicPr/>
+                  </pic:nvPicPr>
+                  <pic:blipFill>
+                    <a:blip xmlns:r="http://schemas.openxmlformats.org/officeDocument/2006/relationships" r:embed="rId1624497862">
+                      <a:extLst>
+                        <a:ext uri="{28A0092B-C50C-407E-A947-70E740481C1C}">
+                          <a14:useLocalDpi xmlns:a14="http://schemas.microsoft.com/office/drawing/2010/main"/>
+                        </a:ext>
+                      </a:extLst>
+                    </a:blip>
+                    <a:stretch>
+                      <a:fillRect/>
+                    </a:stretch>
+                  </pic:blipFill>
+                  <pic:spPr>
+                    <a:xfrm>
+                      <a:off x="0" y="0"/>
+                      <a:ext cx="6324600" cy="2085975"/>
+                    </a:xfrm>
+                    <a:prstGeom prst="rect">
+                      <a:avLst/>
+                    </a:prstGeom>
+                  </pic:spPr>
+                </pic:pic>
+              </a:graphicData>
+            </a:graphic>
+          </wp:inline>
+        </w:drawing>
+      </w:r>
+    </w:p>
+    <w:p>
+      <w:pPr>
+        <w:pStyle w:val="ListParagraph"/>
+        <w:bidi w:val="0"/>
+        <w:spacing w:before="240" w:beforeAutospacing="off" w:after="240" w:afterAutospacing="off"/>
+        <w:ind w:left="720"/>
+        <w:rPr>
+          <w:rFonts w:ascii="Consolas" w:hAnsi="Consolas" w:eastAsia="Consolas" w:cs="Consolas"/>
+          <w:noProof w:val="0"/>
+          <w:sz w:val="20"/>
+          <w:szCs w:val="20"/>
+          <w:lang w:val="en-US"/>
+        </w:rPr>
+      </w:pPr>
+    </w:p>
+    <w:p>
+      <w:pPr>
+        <w:pStyle w:val="ListParagraph"/>
+        <w:bidi w:val="0"/>
+        <w:spacing w:before="240" w:beforeAutospacing="off" w:after="240" w:afterAutospacing="off"/>
+        <w:ind w:left="720"/>
+        <w:rPr>
+          <w:rFonts w:ascii="Consolas" w:hAnsi="Consolas" w:eastAsia="Consolas" w:cs="Consolas"/>
+          <w:noProof w:val="0"/>
+          <w:sz w:val="20"/>
+          <w:szCs w:val="20"/>
+          <w:lang w:val="en-US"/>
+        </w:rPr>
+      </w:pPr>
+    </w:p>
+    <w:p>
+      <w:pPr>
+        <w:pStyle w:val="ListParagraph"/>
+        <w:bidi w:val="0"/>
+        <w:spacing w:before="240" w:beforeAutospacing="off" w:after="240" w:afterAutospacing="off"/>
+        <w:ind w:left="720"/>
+        <w:rPr>
+          <w:rFonts w:ascii="Consolas" w:hAnsi="Consolas" w:eastAsia="Consolas" w:cs="Consolas"/>
+          <w:noProof w:val="0"/>
+          <w:sz w:val="20"/>
+          <w:szCs w:val="20"/>
+          <w:lang w:val="en-US"/>
+        </w:rPr>
+      </w:pPr>
+    </w:p>
+    <w:p>
+      <w:pPr>
+        <w:pStyle w:val="ListParagraph"/>
+        <w:bidi w:val="0"/>
+        <w:spacing w:before="240" w:beforeAutospacing="off" w:after="240" w:afterAutospacing="off"/>
+        <w:ind w:left="720"/>
+        <w:rPr>
+          <w:rFonts w:ascii="Consolas" w:hAnsi="Consolas" w:eastAsia="Consolas" w:cs="Consolas"/>
+          <w:noProof w:val="0"/>
+          <w:sz w:val="20"/>
+          <w:szCs w:val="20"/>
+          <w:lang w:val="en-US"/>
+        </w:rPr>
+      </w:pPr>
+    </w:p>
+    <w:p>
+      <w:pPr>
+        <w:pStyle w:val="ListParagraph"/>
+        <w:bidi w:val="0"/>
+        <w:spacing w:before="240" w:beforeAutospacing="off" w:after="240" w:afterAutospacing="off"/>
+        <w:ind w:left="720"/>
+        <w:rPr>
+          <w:rFonts w:ascii="Consolas" w:hAnsi="Consolas" w:eastAsia="Consolas" w:cs="Consolas"/>
+          <w:noProof w:val="0"/>
+          <w:sz w:val="20"/>
+          <w:szCs w:val="20"/>
+          <w:lang w:val="en-US"/>
+        </w:rPr>
+      </w:pPr>
+    </w:p>
+    <w:p>
+      <w:pPr>
+        <w:pStyle w:val="ListParagraph"/>
+        <w:bidi w:val="0"/>
+        <w:spacing w:before="240" w:beforeAutospacing="off" w:after="240" w:afterAutospacing="off"/>
+        <w:ind w:left="720"/>
+        <w:rPr>
+          <w:rFonts w:ascii="Consolas" w:hAnsi="Consolas" w:eastAsia="Consolas" w:cs="Consolas"/>
+          <w:noProof w:val="0"/>
+          <w:sz w:val="20"/>
+          <w:szCs w:val="20"/>
+          <w:lang w:val="en-US"/>
+        </w:rPr>
+      </w:pPr>
+    </w:p>
+    <w:p>
+      <w:pPr>
+        <w:pStyle w:val="ListParagraph"/>
+        <w:bidi w:val="0"/>
+        <w:spacing w:before="240" w:beforeAutospacing="off" w:after="240" w:afterAutospacing="off"/>
+        <w:ind w:left="720"/>
+        <w:rPr>
+          <w:rFonts w:ascii="Consolas" w:hAnsi="Consolas" w:eastAsia="Consolas" w:cs="Consolas"/>
+          <w:noProof w:val="0"/>
+          <w:sz w:val="20"/>
+          <w:szCs w:val="20"/>
+          <w:lang w:val="en-US"/>
+        </w:rPr>
+      </w:pPr>
+      <w:r>
+        <w:drawing>
+          <wp:inline wp14:editId="4617AAC0" wp14:anchorId="371D4E34">
+            <wp:extent cx="6324600" cy="2295525"/>
+            <wp:effectExtent l="0" t="0" r="0" b="0"/>
+            <wp:docPr id="1360127387" name="drawing"/>
+            <wp:cNvGraphicFramePr>
+              <a:graphicFrameLocks noChangeAspect="1"/>
+            </wp:cNvGraphicFramePr>
+            <a:graphic>
+              <a:graphicData xmlns:a="http://schemas.openxmlformats.org/drawingml/2006/main" uri="http://schemas.openxmlformats.org/drawingml/2006/picture">
+                <pic:pic xmlns:pic="http://schemas.openxmlformats.org/drawingml/2006/picture">
+                  <pic:nvPicPr>
+                    <pic:cNvPr id="1360127387" name="Picture 1360127387"/>
+                    <pic:cNvPicPr/>
+                  </pic:nvPicPr>
+                  <pic:blipFill>
+                    <a:blip xmlns:r="http://schemas.openxmlformats.org/officeDocument/2006/relationships" r:embed="rId121844611">
+                      <a:extLst>
+                        <a:ext uri="{28A0092B-C50C-407E-A947-70E740481C1C}">
+                          <a14:useLocalDpi xmlns:a14="http://schemas.microsoft.com/office/drawing/2010/main"/>
+                        </a:ext>
+                      </a:extLst>
+                    </a:blip>
+                    <a:stretch>
+                      <a:fillRect/>
+                    </a:stretch>
+                  </pic:blipFill>
+                  <pic:spPr>
+                    <a:xfrm>
+                      <a:off x="0" y="0"/>
+                      <a:ext cx="6324600" cy="2295525"/>
+                    </a:xfrm>
+                    <a:prstGeom prst="rect">
+                      <a:avLst/>
+                    </a:prstGeom>
+                  </pic:spPr>
+                </pic:pic>
+              </a:graphicData>
+            </a:graphic>
+          </wp:inline>
+        </w:drawing>
+      </w:r>
+    </w:p>
+    <w:p>
+      <w:pPr>
+        <w:pStyle w:val="ListParagraph"/>
+        <w:bidi w:val="0"/>
+        <w:spacing w:before="240" w:beforeAutospacing="off" w:after="240" w:afterAutospacing="off"/>
+        <w:ind w:left="720"/>
+        <w:rPr>
+          <w:rFonts w:ascii="Consolas" w:hAnsi="Consolas" w:eastAsia="Consolas" w:cs="Consolas"/>
+          <w:noProof w:val="0"/>
+          <w:sz w:val="20"/>
+          <w:szCs w:val="20"/>
+          <w:lang w:val="en-US"/>
+        </w:rPr>
+      </w:pPr>
+    </w:p>
+    <w:p>
+      <w:pPr>
+        <w:pStyle w:val="ListParagraph"/>
+        <w:bidi w:val="0"/>
+        <w:spacing w:before="240" w:beforeAutospacing="off" w:after="240" w:afterAutospacing="off"/>
+        <w:ind w:left="720"/>
+        <w:rPr>
+          <w:rFonts w:ascii="Consolas" w:hAnsi="Consolas" w:eastAsia="Consolas" w:cs="Consolas"/>
+          <w:noProof w:val="0"/>
+          <w:sz w:val="20"/>
+          <w:szCs w:val="20"/>
+          <w:lang w:val="en-US"/>
+        </w:rPr>
+      </w:pPr>
+    </w:p>
+    <w:p>
+      <w:pPr>
+        <w:pStyle w:val="ListParagraph"/>
+        <w:bidi w:val="0"/>
+        <w:spacing w:before="240" w:beforeAutospacing="off" w:after="240" w:afterAutospacing="off"/>
+        <w:ind w:left="720"/>
+        <w:rPr>
+          <w:rFonts w:ascii="Consolas" w:hAnsi="Consolas" w:eastAsia="Consolas" w:cs="Consolas"/>
+          <w:noProof w:val="0"/>
+          <w:sz w:val="20"/>
+          <w:szCs w:val="20"/>
+          <w:lang w:val="en-US"/>
+        </w:rPr>
+      </w:pPr>
+    </w:p>
+    <w:p>
+      <w:pPr>
+        <w:pStyle w:val="Heading3"/>
+        <w:bidi w:val="0"/>
+        <w:spacing w:before="281" w:beforeAutospacing="off" w:after="281" w:afterAutospacing="off"/>
+      </w:pPr>
+      <w:r>
+        <w:rPr>
+          <w:rFonts w:ascii="Arial" w:hAnsi="Arial" w:eastAsia="Arial" w:cs="Arial"/>
+          <w:b w:val="1"/>
+          <w:bCs w:val="1"/>
+          <w:noProof w:val="0"/>
+          <w:sz w:val="28"/>
+          <w:szCs w:val="28"/>
+          <w:lang w:val="en-US"/>
+        </w:rPr>
+        <w:t>3.8 Result</w:t>
+      </w:r>
+    </w:p>
+    <w:p>
+      <w:pPr>
+        <w:bidi w:val="0"/>
+        <w:spacing w:before="240" w:beforeAutospacing="off" w:after="240" w:afterAutospacing="off"/>
+      </w:pPr>
+      <w:r>
+        <w:rPr>
+          <w:rFonts w:ascii="Arial" w:hAnsi="Arial" w:eastAsia="Arial" w:cs="Arial"/>
+          <w:noProof w:val="0"/>
+          <w:sz w:val="20"/>
+          <w:szCs w:val="20"/>
+          <w:lang w:val="en-US"/>
+        </w:rPr>
+        <w:t>Completed. The frontend and backend run on separate EC2 instances, private-network communication is configured, both systemd services are running, and the public browser test succeeded.</w:t>
+      </w:r>
+    </w:p>
+    <w:p/>
     <w:p xmlns:wp14="http://schemas.microsoft.com/office/word/2010/wordml" wp14:textId="77777777">
       <w:pPr>
         <w:pStyle w:val="Heading1"/>
@@ -2890,11 +4410,7 @@
         <w:t>GitHub: https://github.com/pratheeshbabus/AWS_PratheeshBabu</w:t>
       </w:r>
     </w:p>
-    <w:p xmlns:wp14="http://schemas.microsoft.com/office/word/2010/wordml" wp14:textId="77777777">
-      <w:r>
-        <w:t>The public IPv4 address may change after stopping and starting the EC2 instance. Verify the current address before submission. Check AWS charges and remove resources when they are no longer needed.</w:t>
-      </w:r>
-    </w:p>
+    <w:p xmlns:wp14="http://schemas.microsoft.com/office/word/2010/wordml" wp14:textId="149487D4"/>
     <w:sectPr>
       <w:pgSz w:w="12240" w:h="15840" w:orient="portrait"/>
       <w:pgMar w:top="1008" w:right="1152" w:bottom="1008" w:left="1152" w:header="720" w:footer="720" w:gutter="0"/>
@@ -2907,6 +4423,342 @@
 
 <file path=word/numbering.xml><?xml version="1.0" encoding="utf-8"?>
 <w:numbering xmlns:wpc="http://schemas.microsoft.com/office/word/2010/wordprocessingCanvas" xmlns:mo="http://schemas.microsoft.com/office/mac/office/2008/main" xmlns:mc="http://schemas.openxmlformats.org/markup-compatibility/2006" xmlns:mv="urn:schemas-microsoft-com:mac:vml" xmlns:o="urn:schemas-microsoft-com:office:office" xmlns:r="http://schemas.openxmlformats.org/officeDocument/2006/relationships" xmlns:m="http://schemas.openxmlformats.org/officeDocument/2006/math" xmlns:v="urn:schemas-microsoft-com:vml" xmlns:wp14="http://schemas.microsoft.com/office/word/2010/wordprocessingDrawing" xmlns:wp="http://schemas.openxmlformats.org/drawingml/2006/wordprocessingDrawing" xmlns:w10="urn:schemas-microsoft-com:office:word" xmlns:w="http://schemas.openxmlformats.org/wordprocessingml/2006/main" xmlns:w14="http://schemas.microsoft.com/office/word/2010/wordml" xmlns:wpg="http://schemas.microsoft.com/office/word/2010/wordprocessingGroup" xmlns:wpi="http://schemas.microsoft.com/office/word/2010/wordprocessingInk" xmlns:wne="http://schemas.microsoft.com/office/word/2006/wordml" xmlns:wps="http://schemas.microsoft.com/office/word/2010/wordprocessingShape" mc:Ignorable="w14 wp14">
+  <w:abstractNum xmlns:w="http://schemas.openxmlformats.org/wordprocessingml/2006/main" w:abstractNumId="13">
+    <w:nsid w:val="20e17716"/>
+    <w:multiLevelType xmlns:w="http://schemas.openxmlformats.org/wordprocessingml/2006/main" w:val="hybridMultilevel"/>
+    <w:lvl xmlns:w="http://schemas.openxmlformats.org/wordprocessingml/2006/main" w:ilvl="0">
+      <w:start w:val="1"/>
+      <w:numFmt w:val="bullet"/>
+      <w:lvlText w:val=""/>
+      <w:lvlJc w:val="left"/>
+      <w:pPr>
+        <w:ind w:left="720" w:hanging="360"/>
+      </w:pPr>
+      <w:rPr>
+        <w:rFonts w:hint="default" w:ascii="Symbol" w:hAnsi="Symbol"/>
+      </w:rPr>
+    </w:lvl>
+    <w:lvl xmlns:w="http://schemas.openxmlformats.org/wordprocessingml/2006/main" w:ilvl="1">
+      <w:start w:val="1"/>
+      <w:numFmt w:val="bullet"/>
+      <w:lvlText w:val="o"/>
+      <w:lvlJc w:val="left"/>
+      <w:pPr>
+        <w:ind w:left="1440" w:hanging="360"/>
+      </w:pPr>
+      <w:rPr>
+        <w:rFonts w:hint="default" w:ascii="Courier New" w:hAnsi="Courier New"/>
+      </w:rPr>
+    </w:lvl>
+    <w:lvl xmlns:w="http://schemas.openxmlformats.org/wordprocessingml/2006/main" w:ilvl="2">
+      <w:start w:val="1"/>
+      <w:numFmt w:val="bullet"/>
+      <w:lvlText w:val=""/>
+      <w:lvlJc w:val="left"/>
+      <w:pPr>
+        <w:ind w:left="2160" w:hanging="360"/>
+      </w:pPr>
+      <w:rPr>
+        <w:rFonts w:hint="default" w:ascii="Wingdings" w:hAnsi="Wingdings"/>
+      </w:rPr>
+    </w:lvl>
+    <w:lvl xmlns:w="http://schemas.openxmlformats.org/wordprocessingml/2006/main" w:ilvl="3">
+      <w:start w:val="1"/>
+      <w:numFmt w:val="bullet"/>
+      <w:lvlText w:val=""/>
+      <w:lvlJc w:val="left"/>
+      <w:pPr>
+        <w:ind w:left="2880" w:hanging="360"/>
+      </w:pPr>
+      <w:rPr>
+        <w:rFonts w:hint="default" w:ascii="Symbol" w:hAnsi="Symbol"/>
+      </w:rPr>
+    </w:lvl>
+    <w:lvl xmlns:w="http://schemas.openxmlformats.org/wordprocessingml/2006/main" w:ilvl="4">
+      <w:start w:val="1"/>
+      <w:numFmt w:val="bullet"/>
+      <w:lvlText w:val="o"/>
+      <w:lvlJc w:val="left"/>
+      <w:pPr>
+        <w:ind w:left="3600" w:hanging="360"/>
+      </w:pPr>
+      <w:rPr>
+        <w:rFonts w:hint="default" w:ascii="Courier New" w:hAnsi="Courier New"/>
+      </w:rPr>
+    </w:lvl>
+    <w:lvl xmlns:w="http://schemas.openxmlformats.org/wordprocessingml/2006/main" w:ilvl="5">
+      <w:start w:val="1"/>
+      <w:numFmt w:val="bullet"/>
+      <w:lvlText w:val=""/>
+      <w:lvlJc w:val="left"/>
+      <w:pPr>
+        <w:ind w:left="4320" w:hanging="360"/>
+      </w:pPr>
+      <w:rPr>
+        <w:rFonts w:hint="default" w:ascii="Wingdings" w:hAnsi="Wingdings"/>
+      </w:rPr>
+    </w:lvl>
+    <w:lvl xmlns:w="http://schemas.openxmlformats.org/wordprocessingml/2006/main" w:ilvl="6">
+      <w:start w:val="1"/>
+      <w:numFmt w:val="bullet"/>
+      <w:lvlText w:val=""/>
+      <w:lvlJc w:val="left"/>
+      <w:pPr>
+        <w:ind w:left="5040" w:hanging="360"/>
+      </w:pPr>
+      <w:rPr>
+        <w:rFonts w:hint="default" w:ascii="Symbol" w:hAnsi="Symbol"/>
+      </w:rPr>
+    </w:lvl>
+    <w:lvl xmlns:w="http://schemas.openxmlformats.org/wordprocessingml/2006/main" w:ilvl="7">
+      <w:start w:val="1"/>
+      <w:numFmt w:val="bullet"/>
+      <w:lvlText w:val="o"/>
+      <w:lvlJc w:val="left"/>
+      <w:pPr>
+        <w:ind w:left="5760" w:hanging="360"/>
+      </w:pPr>
+      <w:rPr>
+        <w:rFonts w:hint="default" w:ascii="Courier New" w:hAnsi="Courier New"/>
+      </w:rPr>
+    </w:lvl>
+    <w:lvl xmlns:w="http://schemas.openxmlformats.org/wordprocessingml/2006/main" w:ilvl="8">
+      <w:start w:val="1"/>
+      <w:numFmt w:val="bullet"/>
+      <w:lvlText w:val=""/>
+      <w:lvlJc w:val="left"/>
+      <w:pPr>
+        <w:ind w:left="6480" w:hanging="360"/>
+      </w:pPr>
+      <w:rPr>
+        <w:rFonts w:hint="default" w:ascii="Wingdings" w:hAnsi="Wingdings"/>
+      </w:rPr>
+    </w:lvl>
+  </w:abstractNum>
+  <w:abstractNum xmlns:w="http://schemas.openxmlformats.org/wordprocessingml/2006/main" w:abstractNumId="12">
+    <w:nsid w:val="d16481"/>
+    <w:multiLevelType xmlns:w="http://schemas.openxmlformats.org/wordprocessingml/2006/main" w:val="hybridMultilevel"/>
+    <w:lvl xmlns:w="http://schemas.openxmlformats.org/wordprocessingml/2006/main" w:ilvl="0">
+      <w:start w:val="1"/>
+      <w:numFmt w:val="bullet"/>
+      <w:lvlText w:val=""/>
+      <w:lvlJc w:val="left"/>
+      <w:pPr>
+        <w:ind w:left="720" w:hanging="360"/>
+      </w:pPr>
+      <w:rPr>
+        <w:rFonts w:hint="default" w:ascii="Symbol" w:hAnsi="Symbol"/>
+      </w:rPr>
+    </w:lvl>
+    <w:lvl xmlns:w="http://schemas.openxmlformats.org/wordprocessingml/2006/main" w:ilvl="1">
+      <w:start w:val="1"/>
+      <w:numFmt w:val="bullet"/>
+      <w:lvlText w:val="o"/>
+      <w:lvlJc w:val="left"/>
+      <w:pPr>
+        <w:ind w:left="1440" w:hanging="360"/>
+      </w:pPr>
+      <w:rPr>
+        <w:rFonts w:hint="default" w:ascii="Courier New" w:hAnsi="Courier New"/>
+      </w:rPr>
+    </w:lvl>
+    <w:lvl xmlns:w="http://schemas.openxmlformats.org/wordprocessingml/2006/main" w:ilvl="2">
+      <w:start w:val="1"/>
+      <w:numFmt w:val="bullet"/>
+      <w:lvlText w:val=""/>
+      <w:lvlJc w:val="left"/>
+      <w:pPr>
+        <w:ind w:left="2160" w:hanging="360"/>
+      </w:pPr>
+      <w:rPr>
+        <w:rFonts w:hint="default" w:ascii="Wingdings" w:hAnsi="Wingdings"/>
+      </w:rPr>
+    </w:lvl>
+    <w:lvl xmlns:w="http://schemas.openxmlformats.org/wordprocessingml/2006/main" w:ilvl="3">
+      <w:start w:val="1"/>
+      <w:numFmt w:val="bullet"/>
+      <w:lvlText w:val=""/>
+      <w:lvlJc w:val="left"/>
+      <w:pPr>
+        <w:ind w:left="2880" w:hanging="360"/>
+      </w:pPr>
+      <w:rPr>
+        <w:rFonts w:hint="default" w:ascii="Symbol" w:hAnsi="Symbol"/>
+      </w:rPr>
+    </w:lvl>
+    <w:lvl xmlns:w="http://schemas.openxmlformats.org/wordprocessingml/2006/main" w:ilvl="4">
+      <w:start w:val="1"/>
+      <w:numFmt w:val="bullet"/>
+      <w:lvlText w:val="o"/>
+      <w:lvlJc w:val="left"/>
+      <w:pPr>
+        <w:ind w:left="3600" w:hanging="360"/>
+      </w:pPr>
+      <w:rPr>
+        <w:rFonts w:hint="default" w:ascii="Courier New" w:hAnsi="Courier New"/>
+      </w:rPr>
+    </w:lvl>
+    <w:lvl xmlns:w="http://schemas.openxmlformats.org/wordprocessingml/2006/main" w:ilvl="5">
+      <w:start w:val="1"/>
+      <w:numFmt w:val="bullet"/>
+      <w:lvlText w:val=""/>
+      <w:lvlJc w:val="left"/>
+      <w:pPr>
+        <w:ind w:left="4320" w:hanging="360"/>
+      </w:pPr>
+      <w:rPr>
+        <w:rFonts w:hint="default" w:ascii="Wingdings" w:hAnsi="Wingdings"/>
+      </w:rPr>
+    </w:lvl>
+    <w:lvl xmlns:w="http://schemas.openxmlformats.org/wordprocessingml/2006/main" w:ilvl="6">
+      <w:start w:val="1"/>
+      <w:numFmt w:val="bullet"/>
+      <w:lvlText w:val=""/>
+      <w:lvlJc w:val="left"/>
+      <w:pPr>
+        <w:ind w:left="5040" w:hanging="360"/>
+      </w:pPr>
+      <w:rPr>
+        <w:rFonts w:hint="default" w:ascii="Symbol" w:hAnsi="Symbol"/>
+      </w:rPr>
+    </w:lvl>
+    <w:lvl xmlns:w="http://schemas.openxmlformats.org/wordprocessingml/2006/main" w:ilvl="7">
+      <w:start w:val="1"/>
+      <w:numFmt w:val="bullet"/>
+      <w:lvlText w:val="o"/>
+      <w:lvlJc w:val="left"/>
+      <w:pPr>
+        <w:ind w:left="5760" w:hanging="360"/>
+      </w:pPr>
+      <w:rPr>
+        <w:rFonts w:hint="default" w:ascii="Courier New" w:hAnsi="Courier New"/>
+      </w:rPr>
+    </w:lvl>
+    <w:lvl xmlns:w="http://schemas.openxmlformats.org/wordprocessingml/2006/main" w:ilvl="8">
+      <w:start w:val="1"/>
+      <w:numFmt w:val="bullet"/>
+      <w:lvlText w:val=""/>
+      <w:lvlJc w:val="left"/>
+      <w:pPr>
+        <w:ind w:left="6480" w:hanging="360"/>
+      </w:pPr>
+      <w:rPr>
+        <w:rFonts w:hint="default" w:ascii="Wingdings" w:hAnsi="Wingdings"/>
+      </w:rPr>
+    </w:lvl>
+  </w:abstractNum>
+  <w:abstractNum xmlns:w="http://schemas.openxmlformats.org/wordprocessingml/2006/main" w:abstractNumId="11">
+    <w:nsid w:val="6af9cc15"/>
+    <w:multiLevelType xmlns:w="http://schemas.openxmlformats.org/wordprocessingml/2006/main" w:val="hybridMultilevel"/>
+    <w:lvl xmlns:w="http://schemas.openxmlformats.org/wordprocessingml/2006/main" w:ilvl="0">
+      <w:start w:val="1"/>
+      <w:numFmt w:val="bullet"/>
+      <w:lvlText w:val=""/>
+      <w:lvlJc w:val="left"/>
+      <w:pPr>
+        <w:ind w:left="720" w:hanging="360"/>
+      </w:pPr>
+      <w:rPr>
+        <w:rFonts w:hint="default" w:ascii="Symbol" w:hAnsi="Symbol"/>
+      </w:rPr>
+    </w:lvl>
+    <w:lvl xmlns:w="http://schemas.openxmlformats.org/wordprocessingml/2006/main" w:ilvl="1">
+      <w:start w:val="1"/>
+      <w:numFmt w:val="bullet"/>
+      <w:lvlText w:val="o"/>
+      <w:lvlJc w:val="left"/>
+      <w:pPr>
+        <w:ind w:left="1440" w:hanging="360"/>
+      </w:pPr>
+      <w:rPr>
+        <w:rFonts w:hint="default" w:ascii="Courier New" w:hAnsi="Courier New"/>
+      </w:rPr>
+    </w:lvl>
+    <w:lvl xmlns:w="http://schemas.openxmlformats.org/wordprocessingml/2006/main" w:ilvl="2">
+      <w:start w:val="1"/>
+      <w:numFmt w:val="bullet"/>
+      <w:lvlText w:val=""/>
+      <w:lvlJc w:val="left"/>
+      <w:pPr>
+        <w:ind w:left="2160" w:hanging="360"/>
+      </w:pPr>
+      <w:rPr>
+        <w:rFonts w:hint="default" w:ascii="Wingdings" w:hAnsi="Wingdings"/>
+      </w:rPr>
+    </w:lvl>
+    <w:lvl xmlns:w="http://schemas.openxmlformats.org/wordprocessingml/2006/main" w:ilvl="3">
+      <w:start w:val="1"/>
+      <w:numFmt w:val="bullet"/>
+      <w:lvlText w:val=""/>
+      <w:lvlJc w:val="left"/>
+      <w:pPr>
+        <w:ind w:left="2880" w:hanging="360"/>
+      </w:pPr>
+      <w:rPr>
+        <w:rFonts w:hint="default" w:ascii="Symbol" w:hAnsi="Symbol"/>
+      </w:rPr>
+    </w:lvl>
+    <w:lvl xmlns:w="http://schemas.openxmlformats.org/wordprocessingml/2006/main" w:ilvl="4">
+      <w:start w:val="1"/>
+      <w:numFmt w:val="bullet"/>
+      <w:lvlText w:val="o"/>
+      <w:lvlJc w:val="left"/>
+      <w:pPr>
+        <w:ind w:left="3600" w:hanging="360"/>
+      </w:pPr>
+      <w:rPr>
+        <w:rFonts w:hint="default" w:ascii="Courier New" w:hAnsi="Courier New"/>
+      </w:rPr>
+    </w:lvl>
+    <w:lvl xmlns:w="http://schemas.openxmlformats.org/wordprocessingml/2006/main" w:ilvl="5">
+      <w:start w:val="1"/>
+      <w:numFmt w:val="bullet"/>
+      <w:lvlText w:val=""/>
+      <w:lvlJc w:val="left"/>
+      <w:pPr>
+        <w:ind w:left="4320" w:hanging="360"/>
+      </w:pPr>
+      <w:rPr>
+        <w:rFonts w:hint="default" w:ascii="Wingdings" w:hAnsi="Wingdings"/>
+      </w:rPr>
+    </w:lvl>
+    <w:lvl xmlns:w="http://schemas.openxmlformats.org/wordprocessingml/2006/main" w:ilvl="6">
+      <w:start w:val="1"/>
+      <w:numFmt w:val="bullet"/>
+      <w:lvlText w:val=""/>
+      <w:lvlJc w:val="left"/>
+      <w:pPr>
+        <w:ind w:left="5040" w:hanging="360"/>
+      </w:pPr>
+      <w:rPr>
+        <w:rFonts w:hint="default" w:ascii="Symbol" w:hAnsi="Symbol"/>
+      </w:rPr>
+    </w:lvl>
+    <w:lvl xmlns:w="http://schemas.openxmlformats.org/wordprocessingml/2006/main" w:ilvl="7">
+      <w:start w:val="1"/>
+      <w:numFmt w:val="bullet"/>
+      <w:lvlText w:val="o"/>
+      <w:lvlJc w:val="left"/>
+      <w:pPr>
+        <w:ind w:left="5760" w:hanging="360"/>
+      </w:pPr>
+      <w:rPr>
+        <w:rFonts w:hint="default" w:ascii="Courier New" w:hAnsi="Courier New"/>
+      </w:rPr>
+    </w:lvl>
+    <w:lvl xmlns:w="http://schemas.openxmlformats.org/wordprocessingml/2006/main" w:ilvl="8">
+      <w:start w:val="1"/>
+      <w:numFmt w:val="bullet"/>
+      <w:lvlText w:val=""/>
+      <w:lvlJc w:val="left"/>
+      <w:pPr>
+        <w:ind w:left="6480" w:hanging="360"/>
+      </w:pPr>
+      <w:rPr>
+        <w:rFonts w:hint="default" w:ascii="Wingdings" w:hAnsi="Wingdings"/>
+      </w:rPr>
+    </w:lvl>
+  </w:abstractNum>
   <w:abstractNum xmlns:w="http://schemas.openxmlformats.org/wordprocessingml/2006/main" w:abstractNumId="10">
     <w:nsid w:val="3512ba24"/>
     <w:multiLevelType xmlns:w="http://schemas.openxmlformats.org/wordprocessingml/2006/main" w:val="hybridMultilevel"/>
@@ -3275,6 +5127,15 @@
       </w:rPr>
     </w:lvl>
   </w:abstractNum>
+  <w:num w:numId="14">
+    <w:abstractNumId w:val="13"/>
+  </w:num>
+  <w:num w:numId="13">
+    <w:abstractNumId w:val="12"/>
+  </w:num>
+  <w:num w:numId="12">
+    <w:abstractNumId w:val="11"/>
+  </w:num>
   <w:num w:numId="11">
     <w:abstractNumId w:val="10"/>
   </w:num>
@@ -15158,6 +17019,16 @@
         <w:shd w:val="clear" w:color="auto" w:fill="FBCAA2" w:themeFill="accent6" w:themeFillTint="7F"/>
       </w:tcPr>
     </w:tblStylePr>
+  </w:style>
+  <w:style xmlns:w14="http://schemas.microsoft.com/office/word/2010/wordml" xmlns:mc="http://schemas.openxmlformats.org/markup-compatibility/2006" xmlns:w="http://schemas.openxmlformats.org/wordprocessingml/2006/main" w:type="character" w:styleId="Hyperlink" mc:Ignorable="w14">
+    <w:name xmlns:w="http://schemas.openxmlformats.org/wordprocessingml/2006/main" w:val="Hyperlink"/>
+    <w:basedOn xmlns:w="http://schemas.openxmlformats.org/wordprocessingml/2006/main" w:val="DefaultParagraphFont"/>
+    <w:uiPriority xmlns:w="http://schemas.openxmlformats.org/wordprocessingml/2006/main" w:val="99"/>
+    <w:unhideWhenUsed xmlns:w="http://schemas.openxmlformats.org/wordprocessingml/2006/main"/>
+    <w:rPr xmlns:w="http://schemas.openxmlformats.org/wordprocessingml/2006/main">
+      <w:color w:val="0563C1" w:themeColor="hyperlink"/>
+      <w:u w:val="single"/>
+    </w:rPr>
   </w:style>
 </w:styles>
 </file>

</xml_diff>

<commit_message>
Complete AWS assignment documentation and ECS evidence
</commit_message>
<xml_diff>
--- a/docs/AWS_Assignment_Documentation.docx
+++ b/docs/AWS_Assignment_Documentation.docx
@@ -3380,7 +3380,7 @@
         </w:rPr>
         <w:t xml:space="preserve">Frontend URL: </w:t>
       </w:r>
-      <w:hyperlink r:id="R7ef4359959324fc7">
+      <w:hyperlink r:id="R07c4a3771e7f4cca">
         <w:r>
           <w:rPr>
             <w:rStyle w:val="Hyperlink"/>
@@ -3425,7 +3425,7 @@
         </w:rPr>
         <w:t xml:space="preserve">The frontend EC2 instance receives browser requests on TCP port 3000. It communicates with the Flask backend using the private address </w:t>
       </w:r>
-      <w:hyperlink r:id="R555350469cf1417d">
+      <w:hyperlink r:id="Rd6c0c928f55c432a">
         <w:r>
           <w:rPr>
             <w:rStyle w:val="Hyperlink"/>
@@ -3632,7 +3632,7 @@
         </w:rPr>
         <w:t xml:space="preserve">curl </w:t>
       </w:r>
-      <w:hyperlink r:id="R62adfb9b76c64769">
+      <w:hyperlink r:id="R6b369cd6417f4391">
         <w:r>
           <w:rPr>
             <w:rStyle w:val="Hyperlink"/>
@@ -3655,7 +3655,7 @@
         </w:rPr>
         <w:t xml:space="preserve">curl -s </w:t>
       </w:r>
-      <w:hyperlink r:id="Rd98724f495e94202">
+      <w:hyperlink r:id="R38b86740c21e4597">
         <w:r>
           <w:rPr>
             <w:rStyle w:val="Hyperlink"/>
@@ -3706,7 +3706,7 @@
         </w:rPr>
         <w:t xml:space="preserve">curl </w:t>
       </w:r>
-      <w:hyperlink r:id="Rfaa0b2f5dedc4c55">
+      <w:hyperlink r:id="R37b33df294044c71">
         <w:r>
           <w:rPr>
             <w:rStyle w:val="Hyperlink"/>
@@ -4015,20 +4015,13 @@
         <w:bidi w:val="0"/>
         <w:spacing w:before="240" w:beforeAutospacing="off" w:after="240" w:afterAutospacing="off"/>
         <w:ind w:left="720"/>
-        <w:rPr>
-          <w:rFonts w:ascii="Consolas" w:hAnsi="Consolas" w:eastAsia="Consolas" w:cs="Consolas"/>
-          <w:noProof w:val="0"/>
-          <w:sz w:val="20"/>
-          <w:szCs w:val="20"/>
-          <w:lang w:val="en-US"/>
-        </w:rPr>
       </w:pPr>
       <w:r>
         <w:drawing>
-          <wp:inline wp14:editId="769989CB" wp14:anchorId="4C816C2D">
-            <wp:extent cx="6324600" cy="3476625"/>
+          <wp:inline wp14:editId="4023B6A9" wp14:anchorId="3419EACF">
+            <wp:extent cx="6324600" cy="3667125"/>
             <wp:effectExtent l="0" t="0" r="0" b="0"/>
-            <wp:docPr id="260144724" name="drawing"/>
+            <wp:docPr id="105650006" name="drawing"/>
             <wp:cNvGraphicFramePr>
               <a:graphicFrameLocks noChangeAspect="1"/>
             </wp:cNvGraphicFramePr>
@@ -4036,11 +4029,11 @@
               <a:graphicData xmlns:a="http://schemas.openxmlformats.org/drawingml/2006/main" uri="http://schemas.openxmlformats.org/drawingml/2006/picture">
                 <pic:pic xmlns:pic="http://schemas.openxmlformats.org/drawingml/2006/picture">
                   <pic:nvPicPr>
-                    <pic:cNvPr id="260144724" name="Picture 260144724"/>
+                    <pic:cNvPr id="105650006" name="Picture 105650006"/>
                     <pic:cNvPicPr/>
                   </pic:nvPicPr>
                   <pic:blipFill>
-                    <a:blip xmlns:r="http://schemas.openxmlformats.org/officeDocument/2006/relationships" r:embed="rId793340488">
+                    <a:blip xmlns:r="http://schemas.openxmlformats.org/officeDocument/2006/relationships" r:embed="rId2132762210">
                       <a:extLst>
                         <a:ext uri="{28A0092B-C50C-407E-A947-70E740481C1C}">
                           <a14:useLocalDpi xmlns:a14="http://schemas.microsoft.com/office/drawing/2010/main"/>
@@ -4054,7 +4047,7 @@
                   <pic:spPr>
                     <a:xfrm>
                       <a:off x="0" y="0"/>
-                      <a:ext cx="6324600" cy="3476625"/>
+                      <a:ext cx="6324600" cy="3667125"/>
                     </a:xfrm>
                     <a:prstGeom prst="rect">
                       <a:avLst/>
@@ -4113,7 +4106,7 @@
       </w:pPr>
       <w:r>
         <w:drawing>
-          <wp:inline wp14:editId="3F40B70B" wp14:anchorId="69F15FA2">
+          <wp:inline wp14:editId="39CC4277" wp14:anchorId="69F15FA2">
             <wp:extent cx="6324600" cy="2085975"/>
             <wp:effectExtent l="0" t="0" r="0" b="0"/>
             <wp:docPr id="149086025" name="drawing"/>
@@ -4261,7 +4254,7 @@
       </w:pPr>
       <w:r>
         <w:drawing>
-          <wp:inline wp14:editId="4617AAC0" wp14:anchorId="371D4E34">
+          <wp:inline wp14:editId="6FA267A8" wp14:anchorId="371D4E34">
             <wp:extent cx="6324600" cy="2295525"/>
             <wp:effectExtent l="0" t="0" r="0" b="0"/>
             <wp:docPr id="1360127387" name="drawing"/>
@@ -4389,13 +4382,1312 @@
         <w:pStyle w:val="Heading1"/>
       </w:pPr>
       <w:r>
+        <w:rPr/>
         <w:t>4. Deployment 3 — Docker, ECR, ECS and VPC</w:t>
       </w:r>
     </w:p>
-    <w:p xmlns:wp14="http://schemas.microsoft.com/office/word/2010/wordml" wp14:textId="77777777">
+    <w:p>
+      <w:pPr>
+        <w:pStyle w:val="Heading3"/>
+        <w:spacing w:before="0" w:beforeAutospacing="off" w:after="281" w:afterAutospacing="off"/>
+      </w:pPr>
       <w:r>
-        <w:t>Status: Pending. Complete this section after the container deployment and verification.</w:t>
+        <w:rPr>
+          <w:rFonts w:ascii="Arial" w:hAnsi="Arial" w:eastAsia="Arial" w:cs="Arial"/>
+          <w:b w:val="1"/>
+          <w:bCs w:val="1"/>
+          <w:noProof w:val="0"/>
+          <w:sz w:val="28"/>
+          <w:szCs w:val="28"/>
+          <w:lang w:val="en-US"/>
+        </w:rPr>
+        <w:t>4.1 Objective</w:t>
       </w:r>
+    </w:p>
+    <w:p>
+      <w:pPr>
+        <w:spacing w:before="240" w:beforeAutospacing="off" w:after="240" w:afterAutospacing="off"/>
+      </w:pPr>
+      <w:r>
+        <w:rPr>
+          <w:rFonts w:ascii="Arial" w:hAnsi="Arial" w:eastAsia="Arial" w:cs="Arial"/>
+          <w:noProof w:val="0"/>
+          <w:sz w:val="20"/>
+          <w:szCs w:val="20"/>
+          <w:lang w:val="en-US"/>
+        </w:rPr>
+        <w:t>Deploy the Flask backend and Express.js frontend as Docker containers on Amazon ECS using AWS Fargate, with images stored in Amazon ECR.</w:t>
+      </w:r>
+    </w:p>
+    <w:p>
+      <w:pPr>
+        <w:pStyle w:val="Heading3"/>
+        <w:spacing w:before="281" w:beforeAutospacing="off" w:after="281" w:afterAutospacing="off"/>
+      </w:pPr>
+      <w:r>
+        <w:rPr>
+          <w:rFonts w:ascii="Arial" w:hAnsi="Arial" w:eastAsia="Arial" w:cs="Arial"/>
+          <w:b w:val="1"/>
+          <w:bCs w:val="1"/>
+          <w:noProof w:val="0"/>
+          <w:sz w:val="28"/>
+          <w:szCs w:val="28"/>
+          <w:lang w:val="en-US"/>
+        </w:rPr>
+        <w:t>4.2 AWS Infrastructure</w:t>
+      </w:r>
+    </w:p>
+    <w:tbl>
+      <w:tblPr>
+        <w:tblStyle w:val="TableNormal"/>
+        <w:bidiVisual w:val="0"/>
+        <w:tblW w:w="0" w:type="auto"/>
+        <w:tblLook w:val="06A0" w:firstRow="1" w:lastRow="0" w:firstColumn="1" w:lastColumn="0" w:noHBand="1" w:noVBand="1"/>
+      </w:tblPr>
+      <w:tblGrid>
+        <w:gridCol w:w="2173"/>
+        <w:gridCol w:w="3303"/>
+      </w:tblGrid>
+      <w:tr>
+        <w:trPr>
+          <w:trHeight w:val="300"/>
+        </w:trPr>
+        <w:tc>
+          <w:tcPr>
+            <w:tcW w:w="2173" w:type="dxa"/>
+            <w:tcMar/>
+            <w:vAlign w:val="center"/>
+          </w:tcPr>
+          <w:p>
+            <w:pPr>
+              <w:spacing w:before="0" w:beforeAutospacing="off" w:after="0" w:afterAutospacing="off"/>
+              <w:jc w:val="center"/>
+            </w:pPr>
+            <w:r>
+              <w:rPr>
+                <w:b w:val="1"/>
+                <w:bCs w:val="1"/>
+              </w:rPr>
+              <w:t>Property</w:t>
+            </w:r>
+          </w:p>
+        </w:tc>
+        <w:tc>
+          <w:tcPr>
+            <w:tcW w:w="3303" w:type="dxa"/>
+            <w:tcMar/>
+            <w:vAlign w:val="center"/>
+          </w:tcPr>
+          <w:p>
+            <w:pPr>
+              <w:spacing w:before="0" w:beforeAutospacing="off" w:after="0" w:afterAutospacing="off"/>
+              <w:jc w:val="center"/>
+            </w:pPr>
+            <w:r>
+              <w:rPr>
+                <w:b w:val="1"/>
+                <w:bCs w:val="1"/>
+              </w:rPr>
+              <w:t>Configuration</w:t>
+            </w:r>
+          </w:p>
+        </w:tc>
+      </w:tr>
+      <w:tr>
+        <w:trPr>
+          <w:trHeight w:val="300"/>
+        </w:trPr>
+        <w:tc>
+          <w:tcPr>
+            <w:tcW w:w="2173" w:type="dxa"/>
+            <w:tcMar/>
+            <w:vAlign w:val="center"/>
+          </w:tcPr>
+          <w:p>
+            <w:pPr>
+              <w:spacing w:before="0" w:beforeAutospacing="off" w:after="0" w:afterAutospacing="off"/>
+            </w:pPr>
+            <w:r>
+              <w:rPr/>
+              <w:t>AWS Region</w:t>
+            </w:r>
+          </w:p>
+        </w:tc>
+        <w:tc>
+          <w:tcPr>
+            <w:tcW w:w="3303" w:type="dxa"/>
+            <w:tcMar/>
+            <w:vAlign w:val="center"/>
+          </w:tcPr>
+          <w:p>
+            <w:pPr>
+              <w:spacing w:before="0" w:beforeAutospacing="off" w:after="0" w:afterAutospacing="off"/>
+            </w:pPr>
+            <w:r>
+              <w:rPr/>
+              <w:t>Mumbai (</w:t>
+            </w:r>
+            <w:r>
+              <w:rPr>
+                <w:rFonts w:ascii="Consolas" w:hAnsi="Consolas" w:eastAsia="Consolas" w:cs="Consolas"/>
+              </w:rPr>
+              <w:t>ap-south-1</w:t>
+            </w:r>
+            <w:r>
+              <w:rPr/>
+              <w:t>)</w:t>
+            </w:r>
+          </w:p>
+        </w:tc>
+      </w:tr>
+      <w:tr>
+        <w:trPr>
+          <w:trHeight w:val="300"/>
+        </w:trPr>
+        <w:tc>
+          <w:tcPr>
+            <w:tcW w:w="2173" w:type="dxa"/>
+            <w:tcMar/>
+            <w:vAlign w:val="center"/>
+          </w:tcPr>
+          <w:p>
+            <w:pPr>
+              <w:spacing w:before="0" w:beforeAutospacing="off" w:after="0" w:afterAutospacing="off"/>
+            </w:pPr>
+            <w:r>
+              <w:rPr/>
+              <w:t>ECS Cluster</w:t>
+            </w:r>
+          </w:p>
+        </w:tc>
+        <w:tc>
+          <w:tcPr>
+            <w:tcW w:w="3303" w:type="dxa"/>
+            <w:tcMar/>
+            <w:vAlign w:val="center"/>
+          </w:tcPr>
+          <w:p>
+            <w:pPr>
+              <w:spacing w:before="0" w:beforeAutospacing="off" w:after="0" w:afterAutospacing="off"/>
+            </w:pPr>
+            <w:r>
+              <w:rPr>
+                <w:rFonts w:ascii="Consolas" w:hAnsi="Consolas" w:eastAsia="Consolas" w:cs="Consolas"/>
+              </w:rPr>
+              <w:t>tutedude-aws-cluster</w:t>
+            </w:r>
+          </w:p>
+        </w:tc>
+      </w:tr>
+      <w:tr>
+        <w:trPr>
+          <w:trHeight w:val="300"/>
+        </w:trPr>
+        <w:tc>
+          <w:tcPr>
+            <w:tcW w:w="2173" w:type="dxa"/>
+            <w:tcMar/>
+            <w:vAlign w:val="center"/>
+          </w:tcPr>
+          <w:p>
+            <w:pPr>
+              <w:spacing w:before="0" w:beforeAutospacing="off" w:after="0" w:afterAutospacing="off"/>
+            </w:pPr>
+            <w:r>
+              <w:rPr/>
+              <w:t>ECS Service</w:t>
+            </w:r>
+          </w:p>
+        </w:tc>
+        <w:tc>
+          <w:tcPr>
+            <w:tcW w:w="3303" w:type="dxa"/>
+            <w:tcMar/>
+            <w:vAlign w:val="center"/>
+          </w:tcPr>
+          <w:p>
+            <w:pPr>
+              <w:spacing w:before="0" w:beforeAutospacing="off" w:after="0" w:afterAutospacing="off"/>
+            </w:pPr>
+            <w:r>
+              <w:rPr>
+                <w:rFonts w:ascii="Consolas" w:hAnsi="Consolas" w:eastAsia="Consolas" w:cs="Consolas"/>
+              </w:rPr>
+              <w:t>tutedude-aws-service</w:t>
+            </w:r>
+          </w:p>
+        </w:tc>
+      </w:tr>
+      <w:tr>
+        <w:trPr>
+          <w:trHeight w:val="300"/>
+        </w:trPr>
+        <w:tc>
+          <w:tcPr>
+            <w:tcW w:w="2173" w:type="dxa"/>
+            <w:tcMar/>
+            <w:vAlign w:val="center"/>
+          </w:tcPr>
+          <w:p>
+            <w:pPr>
+              <w:spacing w:before="0" w:beforeAutospacing="off" w:after="0" w:afterAutospacing="off"/>
+            </w:pPr>
+            <w:r>
+              <w:rPr/>
+              <w:t>Task Definition</w:t>
+            </w:r>
+          </w:p>
+        </w:tc>
+        <w:tc>
+          <w:tcPr>
+            <w:tcW w:w="3303" w:type="dxa"/>
+            <w:tcMar/>
+            <w:vAlign w:val="center"/>
+          </w:tcPr>
+          <w:p>
+            <w:pPr>
+              <w:spacing w:before="0" w:beforeAutospacing="off" w:after="0" w:afterAutospacing="off"/>
+            </w:pPr>
+            <w:r>
+              <w:rPr>
+                <w:rFonts w:ascii="Consolas" w:hAnsi="Consolas" w:eastAsia="Consolas" w:cs="Consolas"/>
+              </w:rPr>
+              <w:t>tutedude-aws-task:1</w:t>
+            </w:r>
+          </w:p>
+        </w:tc>
+      </w:tr>
+      <w:tr>
+        <w:trPr>
+          <w:trHeight w:val="300"/>
+        </w:trPr>
+        <w:tc>
+          <w:tcPr>
+            <w:tcW w:w="2173" w:type="dxa"/>
+            <w:tcMar/>
+            <w:vAlign w:val="center"/>
+          </w:tcPr>
+          <w:p>
+            <w:pPr>
+              <w:spacing w:before="0" w:beforeAutospacing="off" w:after="0" w:afterAutospacing="off"/>
+            </w:pPr>
+            <w:r>
+              <w:rPr/>
+              <w:t>Launch Type</w:t>
+            </w:r>
+          </w:p>
+        </w:tc>
+        <w:tc>
+          <w:tcPr>
+            <w:tcW w:w="3303" w:type="dxa"/>
+            <w:tcMar/>
+            <w:vAlign w:val="center"/>
+          </w:tcPr>
+          <w:p>
+            <w:pPr>
+              <w:spacing w:before="0" w:beforeAutospacing="off" w:after="0" w:afterAutospacing="off"/>
+            </w:pPr>
+            <w:r>
+              <w:rPr/>
+              <w:t>AWS Fargate</w:t>
+            </w:r>
+          </w:p>
+        </w:tc>
+      </w:tr>
+      <w:tr>
+        <w:trPr>
+          <w:trHeight w:val="300"/>
+        </w:trPr>
+        <w:tc>
+          <w:tcPr>
+            <w:tcW w:w="2173" w:type="dxa"/>
+            <w:tcMar/>
+            <w:vAlign w:val="center"/>
+          </w:tcPr>
+          <w:p>
+            <w:pPr>
+              <w:spacing w:before="0" w:beforeAutospacing="off" w:after="0" w:afterAutospacing="off"/>
+            </w:pPr>
+            <w:r>
+              <w:rPr/>
+              <w:t>Task CPU</w:t>
+            </w:r>
+          </w:p>
+        </w:tc>
+        <w:tc>
+          <w:tcPr>
+            <w:tcW w:w="3303" w:type="dxa"/>
+            <w:tcMar/>
+            <w:vAlign w:val="center"/>
+          </w:tcPr>
+          <w:p>
+            <w:pPr>
+              <w:spacing w:before="0" w:beforeAutospacing="off" w:after="0" w:afterAutospacing="off"/>
+            </w:pPr>
+            <w:r>
+              <w:rPr/>
+              <w:t>0.25 vCPU</w:t>
+            </w:r>
+          </w:p>
+        </w:tc>
+      </w:tr>
+      <w:tr>
+        <w:trPr>
+          <w:trHeight w:val="300"/>
+        </w:trPr>
+        <w:tc>
+          <w:tcPr>
+            <w:tcW w:w="2173" w:type="dxa"/>
+            <w:tcMar/>
+            <w:vAlign w:val="center"/>
+          </w:tcPr>
+          <w:p>
+            <w:pPr>
+              <w:spacing w:before="0" w:beforeAutospacing="off" w:after="0" w:afterAutospacing="off"/>
+            </w:pPr>
+            <w:r>
+              <w:rPr/>
+              <w:t>Task Memory</w:t>
+            </w:r>
+          </w:p>
+        </w:tc>
+        <w:tc>
+          <w:tcPr>
+            <w:tcW w:w="3303" w:type="dxa"/>
+            <w:tcMar/>
+            <w:vAlign w:val="center"/>
+          </w:tcPr>
+          <w:p>
+            <w:pPr>
+              <w:spacing w:before="0" w:beforeAutospacing="off" w:after="0" w:afterAutospacing="off"/>
+            </w:pPr>
+            <w:r>
+              <w:rPr/>
+              <w:t>1 GiB</w:t>
+            </w:r>
+          </w:p>
+        </w:tc>
+      </w:tr>
+      <w:tr>
+        <w:trPr>
+          <w:trHeight w:val="300"/>
+        </w:trPr>
+        <w:tc>
+          <w:tcPr>
+            <w:tcW w:w="2173" w:type="dxa"/>
+            <w:tcMar/>
+            <w:vAlign w:val="center"/>
+          </w:tcPr>
+          <w:p>
+            <w:pPr>
+              <w:spacing w:before="0" w:beforeAutospacing="off" w:after="0" w:afterAutospacing="off"/>
+            </w:pPr>
+            <w:r>
+              <w:rPr/>
+              <w:t>Backend Container</w:t>
+            </w:r>
+          </w:p>
+        </w:tc>
+        <w:tc>
+          <w:tcPr>
+            <w:tcW w:w="3303" w:type="dxa"/>
+            <w:tcMar/>
+            <w:vAlign w:val="center"/>
+          </w:tcPr>
+          <w:p>
+            <w:pPr>
+              <w:spacing w:before="0" w:beforeAutospacing="off" w:after="0" w:afterAutospacing="off"/>
+            </w:pPr>
+            <w:r>
+              <w:rPr>
+                <w:rFonts w:ascii="Consolas" w:hAnsi="Consolas" w:eastAsia="Consolas" w:cs="Consolas"/>
+              </w:rPr>
+              <w:t>flask-backend</w:t>
+            </w:r>
+            <w:r>
+              <w:rPr/>
+              <w:t>, TCP 5000</w:t>
+            </w:r>
+          </w:p>
+        </w:tc>
+      </w:tr>
+      <w:tr>
+        <w:trPr>
+          <w:trHeight w:val="300"/>
+        </w:trPr>
+        <w:tc>
+          <w:tcPr>
+            <w:tcW w:w="2173" w:type="dxa"/>
+            <w:tcMar/>
+            <w:vAlign w:val="center"/>
+          </w:tcPr>
+          <w:p>
+            <w:pPr>
+              <w:spacing w:before="0" w:beforeAutospacing="off" w:after="0" w:afterAutospacing="off"/>
+            </w:pPr>
+            <w:r>
+              <w:rPr/>
+              <w:t>Frontend Container</w:t>
+            </w:r>
+          </w:p>
+        </w:tc>
+        <w:tc>
+          <w:tcPr>
+            <w:tcW w:w="3303" w:type="dxa"/>
+            <w:tcMar/>
+            <w:vAlign w:val="center"/>
+          </w:tcPr>
+          <w:p>
+            <w:pPr>
+              <w:spacing w:before="0" w:beforeAutospacing="off" w:after="0" w:afterAutospacing="off"/>
+            </w:pPr>
+            <w:r>
+              <w:rPr>
+                <w:rFonts w:ascii="Consolas" w:hAnsi="Consolas" w:eastAsia="Consolas" w:cs="Consolas"/>
+              </w:rPr>
+              <w:t>express-frontend</w:t>
+            </w:r>
+            <w:r>
+              <w:rPr/>
+              <w:t>, TCP 3000</w:t>
+            </w:r>
+          </w:p>
+        </w:tc>
+      </w:tr>
+      <w:tr>
+        <w:trPr>
+          <w:trHeight w:val="300"/>
+        </w:trPr>
+        <w:tc>
+          <w:tcPr>
+            <w:tcW w:w="2173" w:type="dxa"/>
+            <w:tcMar/>
+            <w:vAlign w:val="center"/>
+          </w:tcPr>
+          <w:p>
+            <w:pPr>
+              <w:spacing w:before="0" w:beforeAutospacing="off" w:after="0" w:afterAutospacing="off"/>
+            </w:pPr>
+            <w:r>
+              <w:rPr/>
+              <w:t>Backend Image</w:t>
+            </w:r>
+          </w:p>
+        </w:tc>
+        <w:tc>
+          <w:tcPr>
+            <w:tcW w:w="3303" w:type="dxa"/>
+            <w:tcMar/>
+            <w:vAlign w:val="center"/>
+          </w:tcPr>
+          <w:p>
+            <w:pPr>
+              <w:spacing w:before="0" w:beforeAutospacing="off" w:after="0" w:afterAutospacing="off"/>
+            </w:pPr>
+            <w:r>
+              <w:rPr>
+                <w:rFonts w:ascii="Consolas" w:hAnsi="Consolas" w:eastAsia="Consolas" w:cs="Consolas"/>
+              </w:rPr>
+              <w:t>tutedude-flask-backend:v1</w:t>
+            </w:r>
+          </w:p>
+        </w:tc>
+      </w:tr>
+      <w:tr>
+        <w:trPr>
+          <w:trHeight w:val="300"/>
+        </w:trPr>
+        <w:tc>
+          <w:tcPr>
+            <w:tcW w:w="2173" w:type="dxa"/>
+            <w:tcMar/>
+            <w:vAlign w:val="center"/>
+          </w:tcPr>
+          <w:p>
+            <w:pPr>
+              <w:spacing w:before="0" w:beforeAutospacing="off" w:after="0" w:afterAutospacing="off"/>
+            </w:pPr>
+            <w:r>
+              <w:rPr/>
+              <w:t>Frontend Image</w:t>
+            </w:r>
+          </w:p>
+        </w:tc>
+        <w:tc>
+          <w:tcPr>
+            <w:tcW w:w="3303" w:type="dxa"/>
+            <w:tcMar/>
+            <w:vAlign w:val="center"/>
+          </w:tcPr>
+          <w:p>
+            <w:pPr>
+              <w:spacing w:before="0" w:beforeAutospacing="off" w:after="0" w:afterAutospacing="off"/>
+            </w:pPr>
+            <w:r>
+              <w:rPr>
+                <w:rFonts w:ascii="Consolas" w:hAnsi="Consolas" w:eastAsia="Consolas" w:cs="Consolas"/>
+              </w:rPr>
+              <w:t>tutedude-express-frontend:v1</w:t>
+            </w:r>
+          </w:p>
+        </w:tc>
+      </w:tr>
+    </w:tbl>
+    <w:p>
+      <w:pPr>
+        <w:pStyle w:val="Heading3"/>
+        <w:bidi w:val="0"/>
+        <w:spacing w:before="281" w:beforeAutospacing="off" w:after="281" w:afterAutospacing="off"/>
+      </w:pPr>
+      <w:r>
+        <w:rPr>
+          <w:rFonts w:ascii="Arial" w:hAnsi="Arial" w:eastAsia="Arial" w:cs="Arial"/>
+          <w:b w:val="1"/>
+          <w:bCs w:val="1"/>
+          <w:noProof w:val="0"/>
+          <w:sz w:val="28"/>
+          <w:szCs w:val="28"/>
+          <w:lang w:val="en-US"/>
+        </w:rPr>
+        <w:t>4.3 Application Architecture</w:t>
+      </w:r>
+    </w:p>
+    <w:p>
+      <w:pPr>
+        <w:bidi w:val="0"/>
+        <w:spacing w:before="240" w:beforeAutospacing="off" w:after="240" w:afterAutospacing="off"/>
+      </w:pPr>
+      <w:r>
+        <w:rPr>
+          <w:rFonts w:ascii="Arial" w:hAnsi="Arial" w:eastAsia="Arial" w:cs="Arial"/>
+          <w:noProof w:val="0"/>
+          <w:sz w:val="20"/>
+          <w:szCs w:val="20"/>
+          <w:lang w:val="en-US"/>
+        </w:rPr>
+        <w:t>The Flask backend and Express.js frontend run in separate containers within the same ECS Fargate task. Both Docker images are stored in Amazon ECR.</w:t>
+      </w:r>
+    </w:p>
+    <w:p>
+      <w:pPr>
+        <w:bidi w:val="0"/>
+        <w:spacing w:before="240" w:beforeAutospacing="off" w:after="240" w:afterAutospacing="off"/>
+      </w:pPr>
+      <w:r>
+        <w:rPr>
+          <w:rFonts w:ascii="Arial" w:hAnsi="Arial" w:eastAsia="Arial" w:cs="Arial"/>
+          <w:noProof w:val="0"/>
+          <w:sz w:val="20"/>
+          <w:szCs w:val="20"/>
+          <w:lang w:val="en-US"/>
+        </w:rPr>
+        <w:t xml:space="preserve">The Express frontend communicates with the Flask backend using </w:t>
+      </w:r>
+      <w:hyperlink r:id="R01b1ac02aa1148d8">
+        <w:r>
+          <w:rPr>
+            <w:rStyle w:val="Hyperlink"/>
+            <w:noProof w:val="0"/>
+            <w:lang w:val="en-US"/>
+          </w:rPr>
+          <w:t>http://127.0.0.1:5000</w:t>
+        </w:r>
+      </w:hyperlink>
+      <w:r>
+        <w:rPr>
+          <w:rFonts w:ascii="Arial" w:hAnsi="Arial" w:eastAsia="Arial" w:cs="Arial"/>
+          <w:noProof w:val="0"/>
+          <w:sz w:val="20"/>
+          <w:szCs w:val="20"/>
+          <w:lang w:val="en-US"/>
+        </w:rPr>
+        <w:t>. The frontend is exposed on TCP port 3000, while backend port 5000 is not publicly exposed.</w:t>
+      </w:r>
+    </w:p>
+    <w:p>
+      <w:pPr>
+        <w:pStyle w:val="Heading3"/>
+        <w:bidi w:val="0"/>
+        <w:spacing w:before="281" w:beforeAutospacing="off" w:after="281" w:afterAutospacing="off"/>
+      </w:pPr>
+      <w:r>
+        <w:rPr>
+          <w:rFonts w:ascii="Arial" w:hAnsi="Arial" w:eastAsia="Arial" w:cs="Arial"/>
+          <w:b w:val="1"/>
+          <w:bCs w:val="1"/>
+          <w:noProof w:val="0"/>
+          <w:sz w:val="28"/>
+          <w:szCs w:val="28"/>
+          <w:lang w:val="en-US"/>
+        </w:rPr>
+        <w:t>4.4 Service and IAM Configuration</w:t>
+      </w:r>
+    </w:p>
+    <w:p>
+      <w:pPr>
+        <w:pStyle w:val="ListParagraph"/>
+        <w:numPr>
+          <w:ilvl w:val="0"/>
+          <w:numId w:val="15"/>
+        </w:numPr>
+        <w:bidi w:val="0"/>
+        <w:spacing w:before="240" w:beforeAutospacing="off" w:after="240" w:afterAutospacing="off"/>
+        <w:rPr>
+          <w:rFonts w:ascii="Arial" w:hAnsi="Arial" w:eastAsia="Arial" w:cs="Arial"/>
+          <w:noProof w:val="0"/>
+          <w:sz w:val="20"/>
+          <w:szCs w:val="20"/>
+          <w:lang w:val="en-US"/>
+        </w:rPr>
+      </w:pPr>
+      <w:r>
+        <w:rPr>
+          <w:rFonts w:ascii="Arial" w:hAnsi="Arial" w:eastAsia="Arial" w:cs="Arial"/>
+          <w:noProof w:val="0"/>
+          <w:sz w:val="20"/>
+          <w:szCs w:val="20"/>
+          <w:lang w:val="en-US"/>
+        </w:rPr>
+        <w:t xml:space="preserve">ECS task execution role: </w:t>
+      </w:r>
+      <w:r>
+        <w:rPr>
+          <w:rFonts w:ascii="Consolas" w:hAnsi="Consolas" w:eastAsia="Consolas" w:cs="Consolas"/>
+          <w:noProof w:val="0"/>
+          <w:sz w:val="20"/>
+          <w:szCs w:val="20"/>
+          <w:lang w:val="en-US"/>
+        </w:rPr>
+        <w:t>ecsTaskExecutionRole</w:t>
+      </w:r>
+      <w:r>
+        <w:rPr>
+          <w:rFonts w:ascii="Arial" w:hAnsi="Arial" w:eastAsia="Arial" w:cs="Arial"/>
+          <w:noProof w:val="0"/>
+          <w:sz w:val="20"/>
+          <w:szCs w:val="20"/>
+          <w:lang w:val="en-US"/>
+        </w:rPr>
+        <w:t>.</w:t>
+      </w:r>
+    </w:p>
+    <w:p>
+      <w:pPr>
+        <w:pStyle w:val="ListParagraph"/>
+        <w:numPr>
+          <w:ilvl w:val="0"/>
+          <w:numId w:val="15"/>
+        </w:numPr>
+        <w:bidi w:val="0"/>
+        <w:spacing w:before="240" w:beforeAutospacing="off" w:after="240" w:afterAutospacing="off"/>
+        <w:rPr>
+          <w:rFonts w:ascii="Arial" w:hAnsi="Arial" w:eastAsia="Arial" w:cs="Arial"/>
+          <w:noProof w:val="0"/>
+          <w:sz w:val="20"/>
+          <w:szCs w:val="20"/>
+          <w:lang w:val="en-US"/>
+        </w:rPr>
+      </w:pPr>
+      <w:r>
+        <w:rPr>
+          <w:rFonts w:ascii="Arial" w:hAnsi="Arial" w:eastAsia="Arial" w:cs="Arial"/>
+          <w:noProof w:val="0"/>
+          <w:sz w:val="20"/>
+          <w:szCs w:val="20"/>
+          <w:lang w:val="en-US"/>
+        </w:rPr>
+        <w:t xml:space="preserve">AWS managed policy: </w:t>
+      </w:r>
+      <w:r>
+        <w:rPr>
+          <w:rFonts w:ascii="Consolas" w:hAnsi="Consolas" w:eastAsia="Consolas" w:cs="Consolas"/>
+          <w:noProof w:val="0"/>
+          <w:sz w:val="20"/>
+          <w:szCs w:val="20"/>
+          <w:lang w:val="en-US"/>
+        </w:rPr>
+        <w:t>AmazonECSTaskExecutionRolePolicy</w:t>
+      </w:r>
+      <w:r>
+        <w:rPr>
+          <w:rFonts w:ascii="Arial" w:hAnsi="Arial" w:eastAsia="Arial" w:cs="Arial"/>
+          <w:noProof w:val="0"/>
+          <w:sz w:val="20"/>
+          <w:szCs w:val="20"/>
+          <w:lang w:val="en-US"/>
+        </w:rPr>
+        <w:t>.</w:t>
+      </w:r>
+    </w:p>
+    <w:p>
+      <w:pPr>
+        <w:pStyle w:val="ListParagraph"/>
+        <w:numPr>
+          <w:ilvl w:val="0"/>
+          <w:numId w:val="15"/>
+        </w:numPr>
+        <w:bidi w:val="0"/>
+        <w:spacing w:before="240" w:beforeAutospacing="off" w:after="240" w:afterAutospacing="off"/>
+        <w:rPr>
+          <w:rFonts w:ascii="Arial" w:hAnsi="Arial" w:eastAsia="Arial" w:cs="Arial"/>
+          <w:noProof w:val="0"/>
+          <w:sz w:val="20"/>
+          <w:szCs w:val="20"/>
+          <w:lang w:val="en-US"/>
+        </w:rPr>
+      </w:pPr>
+      <w:r>
+        <w:rPr>
+          <w:rFonts w:ascii="Arial" w:hAnsi="Arial" w:eastAsia="Arial" w:cs="Arial"/>
+          <w:noProof w:val="0"/>
+          <w:sz w:val="20"/>
+          <w:szCs w:val="20"/>
+          <w:lang w:val="en-US"/>
+        </w:rPr>
+        <w:t>Container images are pulled from Amazon ECR.</w:t>
+      </w:r>
+    </w:p>
+    <w:p>
+      <w:pPr>
+        <w:pStyle w:val="ListParagraph"/>
+        <w:numPr>
+          <w:ilvl w:val="0"/>
+          <w:numId w:val="15"/>
+        </w:numPr>
+        <w:bidi w:val="0"/>
+        <w:spacing w:before="240" w:beforeAutospacing="off" w:after="240" w:afterAutospacing="off"/>
+        <w:rPr>
+          <w:rFonts w:ascii="Arial" w:hAnsi="Arial" w:eastAsia="Arial" w:cs="Arial"/>
+          <w:noProof w:val="0"/>
+          <w:sz w:val="20"/>
+          <w:szCs w:val="20"/>
+          <w:lang w:val="en-US"/>
+        </w:rPr>
+      </w:pPr>
+      <w:r>
+        <w:rPr>
+          <w:rFonts w:ascii="Arial" w:hAnsi="Arial" w:eastAsia="Arial" w:cs="Arial"/>
+          <w:noProof w:val="0"/>
+          <w:sz w:val="20"/>
+          <w:szCs w:val="20"/>
+          <w:lang w:val="en-US"/>
+        </w:rPr>
+        <w:t>ECS service desired task count: 1.</w:t>
+      </w:r>
+    </w:p>
+    <w:p>
+      <w:pPr>
+        <w:pStyle w:val="ListParagraph"/>
+        <w:numPr>
+          <w:ilvl w:val="0"/>
+          <w:numId w:val="15"/>
+        </w:numPr>
+        <w:bidi w:val="0"/>
+        <w:spacing w:before="240" w:beforeAutospacing="off" w:after="240" w:afterAutospacing="off"/>
+        <w:rPr>
+          <w:rFonts w:ascii="Arial" w:hAnsi="Arial" w:eastAsia="Arial" w:cs="Arial"/>
+          <w:noProof w:val="0"/>
+          <w:sz w:val="20"/>
+          <w:szCs w:val="20"/>
+          <w:lang w:val="en-US"/>
+        </w:rPr>
+      </w:pPr>
+      <w:r>
+        <w:rPr>
+          <w:rFonts w:ascii="Arial" w:hAnsi="Arial" w:eastAsia="Arial" w:cs="Arial"/>
+          <w:noProof w:val="0"/>
+          <w:sz w:val="20"/>
+          <w:szCs w:val="20"/>
+          <w:lang w:val="en-US"/>
+        </w:rPr>
+        <w:t>Both containers were verified as running.</w:t>
+      </w:r>
+    </w:p>
+    <w:p>
+      <w:pPr>
+        <w:pStyle w:val="Heading3"/>
+        <w:bidi w:val="0"/>
+        <w:spacing w:before="281" w:beforeAutospacing="off" w:after="281" w:afterAutospacing="off"/>
+      </w:pPr>
+      <w:r>
+        <w:rPr>
+          <w:rFonts w:ascii="Arial" w:hAnsi="Arial" w:eastAsia="Arial" w:cs="Arial"/>
+          <w:b w:val="1"/>
+          <w:bCs w:val="1"/>
+          <w:noProof w:val="0"/>
+          <w:sz w:val="28"/>
+          <w:szCs w:val="28"/>
+          <w:lang w:val="en-US"/>
+        </w:rPr>
+        <w:t>4.5 Verification</w:t>
+      </w:r>
+    </w:p>
+    <w:p>
+      <w:pPr>
+        <w:bidi w:val="0"/>
+        <w:spacing w:before="240" w:beforeAutospacing="off" w:after="240" w:afterAutospacing="off"/>
+      </w:pPr>
+      <w:r>
+        <w:rPr>
+          <w:rFonts w:ascii="Arial" w:hAnsi="Arial" w:eastAsia="Arial" w:cs="Arial"/>
+          <w:noProof w:val="0"/>
+          <w:sz w:val="20"/>
+          <w:szCs w:val="20"/>
+          <w:lang w:val="en-US"/>
+        </w:rPr>
+        <w:t xml:space="preserve">Public frontend URL: </w:t>
+      </w:r>
+      <w:hyperlink r:id="Rfc3568947f244442">
+        <w:r>
+          <w:rPr>
+            <w:rStyle w:val="Hyperlink"/>
+            <w:noProof w:val="0"/>
+            <w:lang w:val="en-US"/>
+          </w:rPr>
+          <w:t>http://52.66.239.199:3000</w:t>
+        </w:r>
+      </w:hyperlink>
+    </w:p>
+    <w:p>
+      <w:pPr>
+        <w:bidi w:val="0"/>
+        <w:spacing w:before="240" w:beforeAutospacing="off" w:after="240" w:afterAutospacing="off"/>
+      </w:pPr>
+      <w:r>
+        <w:rPr>
+          <w:rFonts w:ascii="Arial" w:hAnsi="Arial" w:eastAsia="Arial" w:cs="Arial"/>
+          <w:noProof w:val="0"/>
+          <w:sz w:val="20"/>
+          <w:szCs w:val="20"/>
+          <w:lang w:val="en-US"/>
+        </w:rPr>
+        <w:t xml:space="preserve">Health endpoint: </w:t>
+      </w:r>
+      <w:hyperlink r:id="Rb20e37a821a14e3b">
+        <w:r>
+          <w:rPr>
+            <w:rStyle w:val="Hyperlink"/>
+            <w:noProof w:val="0"/>
+            <w:lang w:val="en-US"/>
+          </w:rPr>
+          <w:t>http://52.66.239.199:3000/health</w:t>
+        </w:r>
+      </w:hyperlink>
+    </w:p>
+    <w:p>
+      <w:pPr>
+        <w:bidi w:val="0"/>
+        <w:spacing w:before="240" w:beforeAutospacing="off" w:after="240" w:afterAutospacing="off"/>
+      </w:pPr>
+      <w:r>
+        <w:rPr>
+          <w:rFonts w:ascii="Arial" w:hAnsi="Arial" w:eastAsia="Arial" w:cs="Arial"/>
+          <w:noProof w:val="0"/>
+          <w:sz w:val="20"/>
+          <w:szCs w:val="20"/>
+          <w:lang w:val="en-US"/>
+        </w:rPr>
+        <w:t>The frontend and health endpoint were tested successfully in a browser. Both the Express frontend and Flask backend were running.</w:t>
+      </w:r>
+    </w:p>
+    <w:p>
+      <w:pPr>
+        <w:pStyle w:val="Heading3"/>
+        <w:bidi w:val="0"/>
+        <w:spacing w:before="281" w:beforeAutospacing="off" w:after="281" w:afterAutospacing="off"/>
+      </w:pPr>
+      <w:r>
+        <w:rPr>
+          <w:rFonts w:ascii="Arial" w:hAnsi="Arial" w:eastAsia="Arial" w:cs="Arial"/>
+          <w:b w:val="1"/>
+          <w:bCs w:val="1"/>
+          <w:noProof w:val="0"/>
+          <w:sz w:val="28"/>
+          <w:szCs w:val="28"/>
+          <w:lang w:val="en-US"/>
+        </w:rPr>
+        <w:t>4.6 Security</w:t>
+      </w:r>
+    </w:p>
+    <w:p>
+      <w:pPr>
+        <w:pStyle w:val="ListParagraph"/>
+        <w:numPr>
+          <w:ilvl w:val="0"/>
+          <w:numId w:val="16"/>
+        </w:numPr>
+        <w:bidi w:val="0"/>
+        <w:spacing w:before="240" w:beforeAutospacing="off" w:after="240" w:afterAutospacing="off"/>
+        <w:rPr>
+          <w:rFonts w:ascii="Arial" w:hAnsi="Arial" w:eastAsia="Arial" w:cs="Arial"/>
+          <w:noProof w:val="0"/>
+          <w:sz w:val="20"/>
+          <w:szCs w:val="20"/>
+          <w:lang w:val="en-US"/>
+        </w:rPr>
+      </w:pPr>
+      <w:r>
+        <w:rPr>
+          <w:rFonts w:ascii="Arial" w:hAnsi="Arial" w:eastAsia="Arial" w:cs="Arial"/>
+          <w:noProof w:val="0"/>
+          <w:sz w:val="20"/>
+          <w:szCs w:val="20"/>
+          <w:lang w:val="en-US"/>
+        </w:rPr>
+        <w:t>Frontend TCP port 3000 is allowed through the ECS task security group.</w:t>
+      </w:r>
+    </w:p>
+    <w:p>
+      <w:pPr>
+        <w:pStyle w:val="ListParagraph"/>
+        <w:numPr>
+          <w:ilvl w:val="0"/>
+          <w:numId w:val="16"/>
+        </w:numPr>
+        <w:bidi w:val="0"/>
+        <w:spacing w:before="240" w:beforeAutospacing="off" w:after="240" w:afterAutospacing="off"/>
+        <w:rPr>
+          <w:rFonts w:ascii="Arial" w:hAnsi="Arial" w:eastAsia="Arial" w:cs="Arial"/>
+          <w:noProof w:val="0"/>
+          <w:sz w:val="20"/>
+          <w:szCs w:val="20"/>
+          <w:lang w:val="en-US"/>
+        </w:rPr>
+      </w:pPr>
+      <w:r>
+        <w:rPr>
+          <w:rFonts w:ascii="Arial" w:hAnsi="Arial" w:eastAsia="Arial" w:cs="Arial"/>
+          <w:noProof w:val="0"/>
+          <w:sz w:val="20"/>
+          <w:szCs w:val="20"/>
+          <w:lang w:val="en-US"/>
+        </w:rPr>
+        <w:t>Backend TCP port 5000 is not open to the public internet.</w:t>
+      </w:r>
+    </w:p>
+    <w:p>
+      <w:pPr>
+        <w:pStyle w:val="ListParagraph"/>
+        <w:numPr>
+          <w:ilvl w:val="0"/>
+          <w:numId w:val="16"/>
+        </w:numPr>
+        <w:bidi w:val="0"/>
+        <w:spacing w:before="240" w:beforeAutospacing="off" w:after="240" w:afterAutospacing="off"/>
+        <w:rPr>
+          <w:rFonts w:ascii="Arial" w:hAnsi="Arial" w:eastAsia="Arial" w:cs="Arial"/>
+          <w:noProof w:val="0"/>
+          <w:sz w:val="20"/>
+          <w:szCs w:val="20"/>
+          <w:lang w:val="en-US"/>
+        </w:rPr>
+      </w:pPr>
+      <w:r>
+        <w:rPr>
+          <w:rFonts w:ascii="Arial" w:hAnsi="Arial" w:eastAsia="Arial" w:cs="Arial"/>
+          <w:noProof w:val="0"/>
+          <w:sz w:val="20"/>
+          <w:szCs w:val="20"/>
+          <w:lang w:val="en-US"/>
+        </w:rPr>
+        <w:t>The ECS task execution role provides the permissions required to retrieve images from ECR.</w:t>
+      </w:r>
+    </w:p>
+    <w:p>
+      <w:pPr>
+        <w:pStyle w:val="ListParagraph"/>
+        <w:numPr>
+          <w:ilvl w:val="0"/>
+          <w:numId w:val="16"/>
+        </w:numPr>
+        <w:bidi w:val="0"/>
+        <w:spacing w:before="240" w:beforeAutospacing="off" w:after="240" w:afterAutospacing="off"/>
+        <w:rPr>
+          <w:rFonts w:ascii="Arial" w:hAnsi="Arial" w:eastAsia="Arial" w:cs="Arial"/>
+          <w:noProof w:val="0"/>
+          <w:sz w:val="20"/>
+          <w:szCs w:val="20"/>
+          <w:lang w:val="en-US"/>
+        </w:rPr>
+      </w:pPr>
+      <w:r>
+        <w:rPr>
+          <w:rFonts w:ascii="Arial" w:hAnsi="Arial" w:eastAsia="Arial" w:cs="Arial"/>
+          <w:noProof w:val="0"/>
+          <w:sz w:val="20"/>
+          <w:szCs w:val="20"/>
+          <w:lang w:val="en-US"/>
+        </w:rPr>
+        <w:t>AWS credentials and private keys are not stored in the application repository.</w:t>
+      </w:r>
+    </w:p>
+    <w:p>
+      <w:pPr>
+        <w:pStyle w:val="Heading3"/>
+        <w:bidi w:val="0"/>
+        <w:spacing w:before="281" w:beforeAutospacing="off" w:after="281" w:afterAutospacing="off"/>
+      </w:pPr>
+      <w:r>
+        <w:rPr>
+          <w:rFonts w:ascii="Arial" w:hAnsi="Arial" w:eastAsia="Arial" w:cs="Arial"/>
+          <w:b w:val="1"/>
+          <w:bCs w:val="1"/>
+          <w:noProof w:val="0"/>
+          <w:sz w:val="28"/>
+          <w:szCs w:val="28"/>
+          <w:lang w:val="en-US"/>
+        </w:rPr>
+        <w:t>4.7 Screenshot Evidence</w:t>
+      </w:r>
+    </w:p>
+    <w:p>
+      <w:pPr>
+        <w:pStyle w:val="Normal"/>
+        <w:bidi w:val="0"/>
+        <w:rPr>
+          <w:noProof w:val="0"/>
+          <w:lang w:val="en-US"/>
+        </w:rPr>
+      </w:pPr>
+    </w:p>
+    <w:p>
+      <w:pPr>
+        <w:pStyle w:val="Normal"/>
+        <w:bidi w:val="0"/>
+        <w:rPr>
+          <w:noProof w:val="0"/>
+          <w:lang w:val="en-US"/>
+        </w:rPr>
+      </w:pPr>
+    </w:p>
+    <w:p>
+      <w:pPr>
+        <w:pStyle w:val="Normal"/>
+        <w:bidi w:val="0"/>
+        <w:rPr>
+          <w:noProof w:val="0"/>
+          <w:lang w:val="en-US"/>
+        </w:rPr>
+      </w:pPr>
+    </w:p>
+    <w:p>
+      <w:pPr>
+        <w:pStyle w:val="Normal"/>
+        <w:bidi w:val="0"/>
+        <w:rPr>
+          <w:noProof w:val="0"/>
+          <w:lang w:val="en-US"/>
+        </w:rPr>
+      </w:pPr>
+      <w:r>
+        <w:drawing>
+          <wp:inline wp14:editId="6C67CD5F" wp14:anchorId="28460B92">
+            <wp:extent cx="6324600" cy="1952625"/>
+            <wp:effectExtent l="0" t="0" r="0" b="0"/>
+            <wp:docPr id="707408698" name="drawing"/>
+            <wp:cNvGraphicFramePr>
+              <a:graphicFrameLocks noChangeAspect="1"/>
+            </wp:cNvGraphicFramePr>
+            <a:graphic>
+              <a:graphicData xmlns:a="http://schemas.openxmlformats.org/drawingml/2006/main" uri="http://schemas.openxmlformats.org/drawingml/2006/picture">
+                <pic:pic xmlns:pic="http://schemas.openxmlformats.org/drawingml/2006/picture">
+                  <pic:nvPicPr>
+                    <pic:cNvPr id="707408698" name="Picture 707408698"/>
+                    <pic:cNvPicPr/>
+                  </pic:nvPicPr>
+                  <pic:blipFill>
+                    <a:blip xmlns:r="http://schemas.openxmlformats.org/officeDocument/2006/relationships" r:embed="rId1828224209">
+                      <a:extLst>
+                        <a:ext uri="{28A0092B-C50C-407E-A947-70E740481C1C}">
+                          <a14:useLocalDpi xmlns:a14="http://schemas.microsoft.com/office/drawing/2010/main"/>
+                        </a:ext>
+                      </a:extLst>
+                    </a:blip>
+                    <a:stretch>
+                      <a:fillRect/>
+                    </a:stretch>
+                  </pic:blipFill>
+                  <pic:spPr>
+                    <a:xfrm>
+                      <a:off x="0" y="0"/>
+                      <a:ext cx="6324600" cy="1952625"/>
+                    </a:xfrm>
+                    <a:prstGeom prst="rect">
+                      <a:avLst/>
+                    </a:prstGeom>
+                  </pic:spPr>
+                </pic:pic>
+              </a:graphicData>
+            </a:graphic>
+          </wp:inline>
+        </w:drawing>
+      </w:r>
+    </w:p>
+    <w:p>
+      <w:pPr>
+        <w:pStyle w:val="Normal"/>
+        <w:bidi w:val="0"/>
+        <w:rPr>
+          <w:noProof w:val="0"/>
+          <w:lang w:val="en-US"/>
+        </w:rPr>
+      </w:pPr>
+      <w:r>
+        <w:drawing>
+          <wp:inline wp14:editId="137F3B94" wp14:anchorId="38E535BE">
+            <wp:extent cx="6324600" cy="1200150"/>
+            <wp:effectExtent l="0" t="0" r="0" b="0"/>
+            <wp:docPr id="16922051" name="drawing"/>
+            <wp:cNvGraphicFramePr>
+              <a:graphicFrameLocks noChangeAspect="1"/>
+            </wp:cNvGraphicFramePr>
+            <a:graphic>
+              <a:graphicData xmlns:a="http://schemas.openxmlformats.org/drawingml/2006/main" uri="http://schemas.openxmlformats.org/drawingml/2006/picture">
+                <pic:pic xmlns:pic="http://schemas.openxmlformats.org/drawingml/2006/picture">
+                  <pic:nvPicPr>
+                    <pic:cNvPr id="16922051" name="Picture 16922051"/>
+                    <pic:cNvPicPr/>
+                  </pic:nvPicPr>
+                  <pic:blipFill>
+                    <a:blip xmlns:r="http://schemas.openxmlformats.org/officeDocument/2006/relationships" r:embed="rId1043952652">
+                      <a:extLst>
+                        <a:ext uri="{28A0092B-C50C-407E-A947-70E740481C1C}">
+                          <a14:useLocalDpi xmlns:a14="http://schemas.microsoft.com/office/drawing/2010/main"/>
+                        </a:ext>
+                      </a:extLst>
+                    </a:blip>
+                    <a:stretch>
+                      <a:fillRect/>
+                    </a:stretch>
+                  </pic:blipFill>
+                  <pic:spPr>
+                    <a:xfrm>
+                      <a:off x="0" y="0"/>
+                      <a:ext cx="6324600" cy="1200150"/>
+                    </a:xfrm>
+                    <a:prstGeom prst="rect">
+                      <a:avLst/>
+                    </a:prstGeom>
+                  </pic:spPr>
+                </pic:pic>
+              </a:graphicData>
+            </a:graphic>
+          </wp:inline>
+        </w:drawing>
+      </w:r>
+    </w:p>
+    <w:p>
+      <w:pPr>
+        <w:pStyle w:val="Normal"/>
+        <w:bidi w:val="0"/>
+        <w:rPr>
+          <w:noProof w:val="0"/>
+          <w:lang w:val="en-US"/>
+        </w:rPr>
+      </w:pPr>
+      <w:r>
+        <w:drawing>
+          <wp:inline wp14:editId="306EE09F" wp14:anchorId="11F8D6D8">
+            <wp:extent cx="6324600" cy="3762375"/>
+            <wp:effectExtent l="0" t="0" r="0" b="0"/>
+            <wp:docPr id="1068739104" name="drawing"/>
+            <wp:cNvGraphicFramePr>
+              <a:graphicFrameLocks noChangeAspect="1"/>
+            </wp:cNvGraphicFramePr>
+            <a:graphic>
+              <a:graphicData xmlns:a="http://schemas.openxmlformats.org/drawingml/2006/main" uri="http://schemas.openxmlformats.org/drawingml/2006/picture">
+                <pic:pic xmlns:pic="http://schemas.openxmlformats.org/drawingml/2006/picture">
+                  <pic:nvPicPr>
+                    <pic:cNvPr id="1068739104" name="Picture 1068739104"/>
+                    <pic:cNvPicPr/>
+                  </pic:nvPicPr>
+                  <pic:blipFill>
+                    <a:blip xmlns:r="http://schemas.openxmlformats.org/officeDocument/2006/relationships" r:embed="rId946787346">
+                      <a:extLst>
+                        <a:ext uri="{28A0092B-C50C-407E-A947-70E740481C1C}">
+                          <a14:useLocalDpi xmlns:a14="http://schemas.microsoft.com/office/drawing/2010/main"/>
+                        </a:ext>
+                      </a:extLst>
+                    </a:blip>
+                    <a:stretch>
+                      <a:fillRect/>
+                    </a:stretch>
+                  </pic:blipFill>
+                  <pic:spPr>
+                    <a:xfrm>
+                      <a:off x="0" y="0"/>
+                      <a:ext cx="6324600" cy="3762375"/>
+                    </a:xfrm>
+                    <a:prstGeom prst="rect">
+                      <a:avLst/>
+                    </a:prstGeom>
+                  </pic:spPr>
+                </pic:pic>
+              </a:graphicData>
+            </a:graphic>
+          </wp:inline>
+        </w:drawing>
+      </w:r>
+    </w:p>
+    <w:p>
+      <w:pPr>
+        <w:pStyle w:val="Normal"/>
+        <w:bidi w:val="0"/>
+        <w:rPr>
+          <w:noProof w:val="0"/>
+          <w:lang w:val="en-US"/>
+        </w:rPr>
+      </w:pPr>
+    </w:p>
+    <w:p>
+      <w:pPr>
+        <w:pStyle w:val="Normal"/>
+        <w:bidi w:val="0"/>
+        <w:rPr>
+          <w:noProof w:val="0"/>
+          <w:lang w:val="en-US"/>
+        </w:rPr>
+      </w:pPr>
+    </w:p>
+    <w:p>
+      <w:pPr>
+        <w:pStyle w:val="Heading3"/>
+        <w:bidi w:val="0"/>
+        <w:spacing w:before="281" w:beforeAutospacing="off" w:after="281" w:afterAutospacing="off"/>
+      </w:pPr>
+      <w:r>
+        <w:rPr>
+          <w:rFonts w:ascii="Arial" w:hAnsi="Arial" w:eastAsia="Arial" w:cs="Arial"/>
+          <w:b w:val="1"/>
+          <w:bCs w:val="1"/>
+          <w:noProof w:val="0"/>
+          <w:sz w:val="28"/>
+          <w:szCs w:val="28"/>
+          <w:lang w:val="en-US"/>
+        </w:rPr>
+        <w:t>4.8 Result</w:t>
+      </w:r>
+    </w:p>
+    <w:p>
+      <w:pPr>
+        <w:bidi w:val="0"/>
+        <w:spacing w:before="240" w:beforeAutospacing="off" w:after="240" w:afterAutospacing="off"/>
+      </w:pPr>
+      <w:r>
+        <w:rPr>
+          <w:rFonts w:ascii="Arial" w:hAnsi="Arial" w:eastAsia="Arial" w:cs="Arial"/>
+          <w:noProof w:val="0"/>
+          <w:sz w:val="20"/>
+          <w:szCs w:val="20"/>
+          <w:lang w:val="en-US"/>
+        </w:rPr>
+        <w:t>Completed. The Flask backend and Express.js frontend Docker images were pushed to Amazon ECR and deployed using Amazon ECS with AWS Fargate. Both containers were running, and the public frontend and health endpoint were verified successfully.</w:t>
+      </w:r>
+    </w:p>
+    <w:p>
+      <w:pPr>
+        <w:pStyle w:val="Normal"/>
+      </w:pPr>
     </w:p>
     <w:p xmlns:wp14="http://schemas.microsoft.com/office/word/2010/wordml" wp14:textId="77777777">
       <w:pPr>
@@ -4423,6 +5715,342 @@
 
 <file path=word/numbering.xml><?xml version="1.0" encoding="utf-8"?>
 <w:numbering xmlns:wpc="http://schemas.microsoft.com/office/word/2010/wordprocessingCanvas" xmlns:mo="http://schemas.microsoft.com/office/mac/office/2008/main" xmlns:mc="http://schemas.openxmlformats.org/markup-compatibility/2006" xmlns:mv="urn:schemas-microsoft-com:mac:vml" xmlns:o="urn:schemas-microsoft-com:office:office" xmlns:r="http://schemas.openxmlformats.org/officeDocument/2006/relationships" xmlns:m="http://schemas.openxmlformats.org/officeDocument/2006/math" xmlns:v="urn:schemas-microsoft-com:vml" xmlns:wp14="http://schemas.microsoft.com/office/word/2010/wordprocessingDrawing" xmlns:wp="http://schemas.openxmlformats.org/drawingml/2006/wordprocessingDrawing" xmlns:w10="urn:schemas-microsoft-com:office:word" xmlns:w="http://schemas.openxmlformats.org/wordprocessingml/2006/main" xmlns:w14="http://schemas.microsoft.com/office/word/2010/wordml" xmlns:wpg="http://schemas.microsoft.com/office/word/2010/wordprocessingGroup" xmlns:wpi="http://schemas.microsoft.com/office/word/2010/wordprocessingInk" xmlns:wne="http://schemas.microsoft.com/office/word/2006/wordml" xmlns:wps="http://schemas.microsoft.com/office/word/2010/wordprocessingShape" mc:Ignorable="w14 wp14">
+  <w:abstractNum xmlns:w="http://schemas.openxmlformats.org/wordprocessingml/2006/main" w:abstractNumId="16">
+    <w:nsid w:val="745a18b2"/>
+    <w:multiLevelType xmlns:w="http://schemas.openxmlformats.org/wordprocessingml/2006/main" w:val="hybridMultilevel"/>
+    <w:lvl xmlns:w="http://schemas.openxmlformats.org/wordprocessingml/2006/main" w:ilvl="0">
+      <w:start w:val="1"/>
+      <w:numFmt w:val="bullet"/>
+      <w:lvlText w:val=""/>
+      <w:lvlJc w:val="left"/>
+      <w:pPr>
+        <w:ind w:left="720" w:hanging="360"/>
+      </w:pPr>
+      <w:rPr>
+        <w:rFonts w:hint="default" w:ascii="Symbol" w:hAnsi="Symbol"/>
+      </w:rPr>
+    </w:lvl>
+    <w:lvl xmlns:w="http://schemas.openxmlformats.org/wordprocessingml/2006/main" w:ilvl="1">
+      <w:start w:val="1"/>
+      <w:numFmt w:val="bullet"/>
+      <w:lvlText w:val="o"/>
+      <w:lvlJc w:val="left"/>
+      <w:pPr>
+        <w:ind w:left="1440" w:hanging="360"/>
+      </w:pPr>
+      <w:rPr>
+        <w:rFonts w:hint="default" w:ascii="Courier New" w:hAnsi="Courier New"/>
+      </w:rPr>
+    </w:lvl>
+    <w:lvl xmlns:w="http://schemas.openxmlformats.org/wordprocessingml/2006/main" w:ilvl="2">
+      <w:start w:val="1"/>
+      <w:numFmt w:val="bullet"/>
+      <w:lvlText w:val=""/>
+      <w:lvlJc w:val="left"/>
+      <w:pPr>
+        <w:ind w:left="2160" w:hanging="360"/>
+      </w:pPr>
+      <w:rPr>
+        <w:rFonts w:hint="default" w:ascii="Wingdings" w:hAnsi="Wingdings"/>
+      </w:rPr>
+    </w:lvl>
+    <w:lvl xmlns:w="http://schemas.openxmlformats.org/wordprocessingml/2006/main" w:ilvl="3">
+      <w:start w:val="1"/>
+      <w:numFmt w:val="bullet"/>
+      <w:lvlText w:val=""/>
+      <w:lvlJc w:val="left"/>
+      <w:pPr>
+        <w:ind w:left="2880" w:hanging="360"/>
+      </w:pPr>
+      <w:rPr>
+        <w:rFonts w:hint="default" w:ascii="Symbol" w:hAnsi="Symbol"/>
+      </w:rPr>
+    </w:lvl>
+    <w:lvl xmlns:w="http://schemas.openxmlformats.org/wordprocessingml/2006/main" w:ilvl="4">
+      <w:start w:val="1"/>
+      <w:numFmt w:val="bullet"/>
+      <w:lvlText w:val="o"/>
+      <w:lvlJc w:val="left"/>
+      <w:pPr>
+        <w:ind w:left="3600" w:hanging="360"/>
+      </w:pPr>
+      <w:rPr>
+        <w:rFonts w:hint="default" w:ascii="Courier New" w:hAnsi="Courier New"/>
+      </w:rPr>
+    </w:lvl>
+    <w:lvl xmlns:w="http://schemas.openxmlformats.org/wordprocessingml/2006/main" w:ilvl="5">
+      <w:start w:val="1"/>
+      <w:numFmt w:val="bullet"/>
+      <w:lvlText w:val=""/>
+      <w:lvlJc w:val="left"/>
+      <w:pPr>
+        <w:ind w:left="4320" w:hanging="360"/>
+      </w:pPr>
+      <w:rPr>
+        <w:rFonts w:hint="default" w:ascii="Wingdings" w:hAnsi="Wingdings"/>
+      </w:rPr>
+    </w:lvl>
+    <w:lvl xmlns:w="http://schemas.openxmlformats.org/wordprocessingml/2006/main" w:ilvl="6">
+      <w:start w:val="1"/>
+      <w:numFmt w:val="bullet"/>
+      <w:lvlText w:val=""/>
+      <w:lvlJc w:val="left"/>
+      <w:pPr>
+        <w:ind w:left="5040" w:hanging="360"/>
+      </w:pPr>
+      <w:rPr>
+        <w:rFonts w:hint="default" w:ascii="Symbol" w:hAnsi="Symbol"/>
+      </w:rPr>
+    </w:lvl>
+    <w:lvl xmlns:w="http://schemas.openxmlformats.org/wordprocessingml/2006/main" w:ilvl="7">
+      <w:start w:val="1"/>
+      <w:numFmt w:val="bullet"/>
+      <w:lvlText w:val="o"/>
+      <w:lvlJc w:val="left"/>
+      <w:pPr>
+        <w:ind w:left="5760" w:hanging="360"/>
+      </w:pPr>
+      <w:rPr>
+        <w:rFonts w:hint="default" w:ascii="Courier New" w:hAnsi="Courier New"/>
+      </w:rPr>
+    </w:lvl>
+    <w:lvl xmlns:w="http://schemas.openxmlformats.org/wordprocessingml/2006/main" w:ilvl="8">
+      <w:start w:val="1"/>
+      <w:numFmt w:val="bullet"/>
+      <w:lvlText w:val=""/>
+      <w:lvlJc w:val="left"/>
+      <w:pPr>
+        <w:ind w:left="6480" w:hanging="360"/>
+      </w:pPr>
+      <w:rPr>
+        <w:rFonts w:hint="default" w:ascii="Wingdings" w:hAnsi="Wingdings"/>
+      </w:rPr>
+    </w:lvl>
+  </w:abstractNum>
+  <w:abstractNum xmlns:w="http://schemas.openxmlformats.org/wordprocessingml/2006/main" w:abstractNumId="15">
+    <w:nsid w:val="44beead5"/>
+    <w:multiLevelType xmlns:w="http://schemas.openxmlformats.org/wordprocessingml/2006/main" w:val="hybridMultilevel"/>
+    <w:lvl xmlns:w="http://schemas.openxmlformats.org/wordprocessingml/2006/main" w:ilvl="0">
+      <w:start w:val="1"/>
+      <w:numFmt w:val="bullet"/>
+      <w:lvlText w:val=""/>
+      <w:lvlJc w:val="left"/>
+      <w:pPr>
+        <w:ind w:left="720" w:hanging="360"/>
+      </w:pPr>
+      <w:rPr>
+        <w:rFonts w:hint="default" w:ascii="Symbol" w:hAnsi="Symbol"/>
+      </w:rPr>
+    </w:lvl>
+    <w:lvl xmlns:w="http://schemas.openxmlformats.org/wordprocessingml/2006/main" w:ilvl="1">
+      <w:start w:val="1"/>
+      <w:numFmt w:val="bullet"/>
+      <w:lvlText w:val="o"/>
+      <w:lvlJc w:val="left"/>
+      <w:pPr>
+        <w:ind w:left="1440" w:hanging="360"/>
+      </w:pPr>
+      <w:rPr>
+        <w:rFonts w:hint="default" w:ascii="Courier New" w:hAnsi="Courier New"/>
+      </w:rPr>
+    </w:lvl>
+    <w:lvl xmlns:w="http://schemas.openxmlformats.org/wordprocessingml/2006/main" w:ilvl="2">
+      <w:start w:val="1"/>
+      <w:numFmt w:val="bullet"/>
+      <w:lvlText w:val=""/>
+      <w:lvlJc w:val="left"/>
+      <w:pPr>
+        <w:ind w:left="2160" w:hanging="360"/>
+      </w:pPr>
+      <w:rPr>
+        <w:rFonts w:hint="default" w:ascii="Wingdings" w:hAnsi="Wingdings"/>
+      </w:rPr>
+    </w:lvl>
+    <w:lvl xmlns:w="http://schemas.openxmlformats.org/wordprocessingml/2006/main" w:ilvl="3">
+      <w:start w:val="1"/>
+      <w:numFmt w:val="bullet"/>
+      <w:lvlText w:val=""/>
+      <w:lvlJc w:val="left"/>
+      <w:pPr>
+        <w:ind w:left="2880" w:hanging="360"/>
+      </w:pPr>
+      <w:rPr>
+        <w:rFonts w:hint="default" w:ascii="Symbol" w:hAnsi="Symbol"/>
+      </w:rPr>
+    </w:lvl>
+    <w:lvl xmlns:w="http://schemas.openxmlformats.org/wordprocessingml/2006/main" w:ilvl="4">
+      <w:start w:val="1"/>
+      <w:numFmt w:val="bullet"/>
+      <w:lvlText w:val="o"/>
+      <w:lvlJc w:val="left"/>
+      <w:pPr>
+        <w:ind w:left="3600" w:hanging="360"/>
+      </w:pPr>
+      <w:rPr>
+        <w:rFonts w:hint="default" w:ascii="Courier New" w:hAnsi="Courier New"/>
+      </w:rPr>
+    </w:lvl>
+    <w:lvl xmlns:w="http://schemas.openxmlformats.org/wordprocessingml/2006/main" w:ilvl="5">
+      <w:start w:val="1"/>
+      <w:numFmt w:val="bullet"/>
+      <w:lvlText w:val=""/>
+      <w:lvlJc w:val="left"/>
+      <w:pPr>
+        <w:ind w:left="4320" w:hanging="360"/>
+      </w:pPr>
+      <w:rPr>
+        <w:rFonts w:hint="default" w:ascii="Wingdings" w:hAnsi="Wingdings"/>
+      </w:rPr>
+    </w:lvl>
+    <w:lvl xmlns:w="http://schemas.openxmlformats.org/wordprocessingml/2006/main" w:ilvl="6">
+      <w:start w:val="1"/>
+      <w:numFmt w:val="bullet"/>
+      <w:lvlText w:val=""/>
+      <w:lvlJc w:val="left"/>
+      <w:pPr>
+        <w:ind w:left="5040" w:hanging="360"/>
+      </w:pPr>
+      <w:rPr>
+        <w:rFonts w:hint="default" w:ascii="Symbol" w:hAnsi="Symbol"/>
+      </w:rPr>
+    </w:lvl>
+    <w:lvl xmlns:w="http://schemas.openxmlformats.org/wordprocessingml/2006/main" w:ilvl="7">
+      <w:start w:val="1"/>
+      <w:numFmt w:val="bullet"/>
+      <w:lvlText w:val="o"/>
+      <w:lvlJc w:val="left"/>
+      <w:pPr>
+        <w:ind w:left="5760" w:hanging="360"/>
+      </w:pPr>
+      <w:rPr>
+        <w:rFonts w:hint="default" w:ascii="Courier New" w:hAnsi="Courier New"/>
+      </w:rPr>
+    </w:lvl>
+    <w:lvl xmlns:w="http://schemas.openxmlformats.org/wordprocessingml/2006/main" w:ilvl="8">
+      <w:start w:val="1"/>
+      <w:numFmt w:val="bullet"/>
+      <w:lvlText w:val=""/>
+      <w:lvlJc w:val="left"/>
+      <w:pPr>
+        <w:ind w:left="6480" w:hanging="360"/>
+      </w:pPr>
+      <w:rPr>
+        <w:rFonts w:hint="default" w:ascii="Wingdings" w:hAnsi="Wingdings"/>
+      </w:rPr>
+    </w:lvl>
+  </w:abstractNum>
+  <w:abstractNum xmlns:w="http://schemas.openxmlformats.org/wordprocessingml/2006/main" w:abstractNumId="14">
+    <w:nsid w:val="f7203da"/>
+    <w:multiLevelType xmlns:w="http://schemas.openxmlformats.org/wordprocessingml/2006/main" w:val="hybridMultilevel"/>
+    <w:lvl xmlns:w="http://schemas.openxmlformats.org/wordprocessingml/2006/main" w:ilvl="0">
+      <w:start w:val="1"/>
+      <w:numFmt w:val="bullet"/>
+      <w:lvlText w:val=""/>
+      <w:lvlJc w:val="left"/>
+      <w:pPr>
+        <w:ind w:left="720" w:hanging="360"/>
+      </w:pPr>
+      <w:rPr>
+        <w:rFonts w:hint="default" w:ascii="Symbol" w:hAnsi="Symbol"/>
+      </w:rPr>
+    </w:lvl>
+    <w:lvl xmlns:w="http://schemas.openxmlformats.org/wordprocessingml/2006/main" w:ilvl="1">
+      <w:start w:val="1"/>
+      <w:numFmt w:val="bullet"/>
+      <w:lvlText w:val="o"/>
+      <w:lvlJc w:val="left"/>
+      <w:pPr>
+        <w:ind w:left="1440" w:hanging="360"/>
+      </w:pPr>
+      <w:rPr>
+        <w:rFonts w:hint="default" w:ascii="Courier New" w:hAnsi="Courier New"/>
+      </w:rPr>
+    </w:lvl>
+    <w:lvl xmlns:w="http://schemas.openxmlformats.org/wordprocessingml/2006/main" w:ilvl="2">
+      <w:start w:val="1"/>
+      <w:numFmt w:val="bullet"/>
+      <w:lvlText w:val=""/>
+      <w:lvlJc w:val="left"/>
+      <w:pPr>
+        <w:ind w:left="2160" w:hanging="360"/>
+      </w:pPr>
+      <w:rPr>
+        <w:rFonts w:hint="default" w:ascii="Wingdings" w:hAnsi="Wingdings"/>
+      </w:rPr>
+    </w:lvl>
+    <w:lvl xmlns:w="http://schemas.openxmlformats.org/wordprocessingml/2006/main" w:ilvl="3">
+      <w:start w:val="1"/>
+      <w:numFmt w:val="bullet"/>
+      <w:lvlText w:val=""/>
+      <w:lvlJc w:val="left"/>
+      <w:pPr>
+        <w:ind w:left="2880" w:hanging="360"/>
+      </w:pPr>
+      <w:rPr>
+        <w:rFonts w:hint="default" w:ascii="Symbol" w:hAnsi="Symbol"/>
+      </w:rPr>
+    </w:lvl>
+    <w:lvl xmlns:w="http://schemas.openxmlformats.org/wordprocessingml/2006/main" w:ilvl="4">
+      <w:start w:val="1"/>
+      <w:numFmt w:val="bullet"/>
+      <w:lvlText w:val="o"/>
+      <w:lvlJc w:val="left"/>
+      <w:pPr>
+        <w:ind w:left="3600" w:hanging="360"/>
+      </w:pPr>
+      <w:rPr>
+        <w:rFonts w:hint="default" w:ascii="Courier New" w:hAnsi="Courier New"/>
+      </w:rPr>
+    </w:lvl>
+    <w:lvl xmlns:w="http://schemas.openxmlformats.org/wordprocessingml/2006/main" w:ilvl="5">
+      <w:start w:val="1"/>
+      <w:numFmt w:val="bullet"/>
+      <w:lvlText w:val=""/>
+      <w:lvlJc w:val="left"/>
+      <w:pPr>
+        <w:ind w:left="4320" w:hanging="360"/>
+      </w:pPr>
+      <w:rPr>
+        <w:rFonts w:hint="default" w:ascii="Wingdings" w:hAnsi="Wingdings"/>
+      </w:rPr>
+    </w:lvl>
+    <w:lvl xmlns:w="http://schemas.openxmlformats.org/wordprocessingml/2006/main" w:ilvl="6">
+      <w:start w:val="1"/>
+      <w:numFmt w:val="bullet"/>
+      <w:lvlText w:val=""/>
+      <w:lvlJc w:val="left"/>
+      <w:pPr>
+        <w:ind w:left="5040" w:hanging="360"/>
+      </w:pPr>
+      <w:rPr>
+        <w:rFonts w:hint="default" w:ascii="Symbol" w:hAnsi="Symbol"/>
+      </w:rPr>
+    </w:lvl>
+    <w:lvl xmlns:w="http://schemas.openxmlformats.org/wordprocessingml/2006/main" w:ilvl="7">
+      <w:start w:val="1"/>
+      <w:numFmt w:val="bullet"/>
+      <w:lvlText w:val="o"/>
+      <w:lvlJc w:val="left"/>
+      <w:pPr>
+        <w:ind w:left="5760" w:hanging="360"/>
+      </w:pPr>
+      <w:rPr>
+        <w:rFonts w:hint="default" w:ascii="Courier New" w:hAnsi="Courier New"/>
+      </w:rPr>
+    </w:lvl>
+    <w:lvl xmlns:w="http://schemas.openxmlformats.org/wordprocessingml/2006/main" w:ilvl="8">
+      <w:start w:val="1"/>
+      <w:numFmt w:val="bullet"/>
+      <w:lvlText w:val=""/>
+      <w:lvlJc w:val="left"/>
+      <w:pPr>
+        <w:ind w:left="6480" w:hanging="360"/>
+      </w:pPr>
+      <w:rPr>
+        <w:rFonts w:hint="default" w:ascii="Wingdings" w:hAnsi="Wingdings"/>
+      </w:rPr>
+    </w:lvl>
+  </w:abstractNum>
   <w:abstractNum xmlns:w="http://schemas.openxmlformats.org/wordprocessingml/2006/main" w:abstractNumId="13">
     <w:nsid w:val="20e17716"/>
     <w:multiLevelType xmlns:w="http://schemas.openxmlformats.org/wordprocessingml/2006/main" w:val="hybridMultilevel"/>
@@ -5127,6 +6755,15 @@
       </w:rPr>
     </w:lvl>
   </w:abstractNum>
+  <w:num w:numId="17">
+    <w:abstractNumId w:val="16"/>
+  </w:num>
+  <w:num w:numId="16">
+    <w:abstractNumId w:val="15"/>
+  </w:num>
+  <w:num w:numId="15">
+    <w:abstractNumId w:val="14"/>
+  </w:num>
   <w:num w:numId="14">
     <w:abstractNumId w:val="13"/>
   </w:num>

</xml_diff>